<commit_message>
chore: sync outstanding workspace updates
</commit_message>
<xml_diff>
--- a/troubleshooting/Forensic and Methodological Deep Research Study for an MCP Geospatial Server.docx
+++ b/troubleshooting/Forensic and Methodological Deep Research Study for an MCP Geospatial Server.docx
@@ -458,11 +458,11 @@
         <w:tblLook w:val="0020" w:firstRow="1" w:lastRow="0" w:firstColumn="0" w:lastColumn="0" w:noHBand="0" w:noVBand="0"/>
       </w:tblPr>
       <w:tblGrid>
-        <w:gridCol w:w="473"/>
-        <w:gridCol w:w="2361"/>
-        <w:gridCol w:w="3351"/>
-        <w:gridCol w:w="866"/>
-        <w:gridCol w:w="1283"/>
+        <w:gridCol w:w="430"/>
+        <w:gridCol w:w="2003"/>
+        <w:gridCol w:w="2829"/>
+        <w:gridCol w:w="758"/>
+        <w:gridCol w:w="1105"/>
       </w:tblGrid>
       <w:tr>
         <w:trPr>
@@ -476,9 +476,19 @@
           <w:p>
             <w:pPr>
               <w:pStyle w:val="Compact"/>
+              <w:keepNext/>
               <w:jc w:val="right"/>
+              <w:rPr>
+                <w:sz w:val="20"/>
+                <w:szCs w:val="20"/>
+              </w:rPr>
             </w:pPr>
             <w:r>
+              <w:rPr>
+                <w:sz w:val="20"/>
+                <w:szCs w:val="20"/>
+              </w:rPr>
+              <w:lastRenderedPageBreak/>
               <w:t>id</w:t>
             </w:r>
           </w:p>
@@ -490,8 +500,17 @@
           <w:p>
             <w:pPr>
               <w:pStyle w:val="Compact"/>
+              <w:keepNext/>
+              <w:rPr>
+                <w:sz w:val="20"/>
+                <w:szCs w:val="20"/>
+              </w:rPr>
             </w:pPr>
             <w:r>
+              <w:rPr>
+                <w:sz w:val="20"/>
+                <w:szCs w:val="20"/>
+              </w:rPr>
               <w:t>start (UTC)</w:t>
             </w:r>
           </w:p>
@@ -503,8 +522,17 @@
           <w:p>
             <w:pPr>
               <w:pStyle w:val="Compact"/>
+              <w:keepNext/>
+              <w:rPr>
+                <w:sz w:val="20"/>
+                <w:szCs w:val="20"/>
+              </w:rPr>
             </w:pPr>
             <w:r>
+              <w:rPr>
+                <w:sz w:val="20"/>
+                <w:szCs w:val="20"/>
+              </w:rPr>
               <w:t>tool</w:t>
             </w:r>
           </w:p>
@@ -516,9 +544,18 @@
           <w:p>
             <w:pPr>
               <w:pStyle w:val="Compact"/>
+              <w:keepNext/>
               <w:jc w:val="right"/>
+              <w:rPr>
+                <w:sz w:val="20"/>
+                <w:szCs w:val="20"/>
+              </w:rPr>
             </w:pPr>
             <w:r>
+              <w:rPr>
+                <w:sz w:val="20"/>
+                <w:szCs w:val="20"/>
+              </w:rPr>
               <w:t>status</w:t>
             </w:r>
           </w:p>
@@ -530,9 +567,18 @@
           <w:p>
             <w:pPr>
               <w:pStyle w:val="Compact"/>
+              <w:keepNext/>
               <w:jc w:val="right"/>
+              <w:rPr>
+                <w:sz w:val="20"/>
+                <w:szCs w:val="20"/>
+              </w:rPr>
             </w:pPr>
             <w:r>
+              <w:rPr>
+                <w:sz w:val="20"/>
+                <w:szCs w:val="20"/>
+              </w:rPr>
               <w:t>latency (s)</w:t>
             </w:r>
           </w:p>
@@ -546,9 +592,18 @@
           <w:p>
             <w:pPr>
               <w:pStyle w:val="Compact"/>
+              <w:keepNext/>
               <w:jc w:val="right"/>
+              <w:rPr>
+                <w:sz w:val="20"/>
+                <w:szCs w:val="20"/>
+              </w:rPr>
             </w:pPr>
             <w:r>
+              <w:rPr>
+                <w:sz w:val="20"/>
+                <w:szCs w:val="20"/>
+              </w:rPr>
               <w:t>15</w:t>
             </w:r>
           </w:p>
@@ -560,8 +615,17 @@
           <w:p>
             <w:pPr>
               <w:pStyle w:val="Compact"/>
+              <w:keepNext/>
+              <w:rPr>
+                <w:sz w:val="20"/>
+                <w:szCs w:val="20"/>
+              </w:rPr>
             </w:pPr>
             <w:r>
+              <w:rPr>
+                <w:sz w:val="20"/>
+                <w:szCs w:val="20"/>
+              </w:rPr>
               <w:t>2026-02-18 14:34:37</w:t>
             </w:r>
           </w:p>
@@ -573,8 +637,17 @@
           <w:p>
             <w:pPr>
               <w:pStyle w:val="Compact"/>
+              <w:keepNext/>
+              <w:rPr>
+                <w:sz w:val="20"/>
+                <w:szCs w:val="20"/>
+              </w:rPr>
             </w:pPr>
             <w:r>
+              <w:rPr>
+                <w:sz w:val="20"/>
+                <w:szCs w:val="20"/>
+              </w:rPr>
               <w:t>os_names_find</w:t>
             </w:r>
           </w:p>
@@ -586,9 +659,18 @@
           <w:p>
             <w:pPr>
               <w:pStyle w:val="Compact"/>
+              <w:keepNext/>
               <w:jc w:val="right"/>
+              <w:rPr>
+                <w:sz w:val="20"/>
+                <w:szCs w:val="20"/>
+              </w:rPr>
             </w:pPr>
             <w:r>
+              <w:rPr>
+                <w:sz w:val="20"/>
+                <w:szCs w:val="20"/>
+              </w:rPr>
               <w:t>200</w:t>
             </w:r>
           </w:p>
@@ -600,9 +682,18 @@
           <w:p>
             <w:pPr>
               <w:pStyle w:val="Compact"/>
+              <w:keepNext/>
               <w:jc w:val="right"/>
+              <w:rPr>
+                <w:sz w:val="20"/>
+                <w:szCs w:val="20"/>
+              </w:rPr>
             </w:pPr>
             <w:r>
+              <w:rPr>
+                <w:sz w:val="20"/>
+                <w:szCs w:val="20"/>
+              </w:rPr>
               <w:t>0.510</w:t>
             </w:r>
           </w:p>
@@ -616,9 +707,18 @@
           <w:p>
             <w:pPr>
               <w:pStyle w:val="Compact"/>
+              <w:keepNext/>
               <w:jc w:val="right"/>
+              <w:rPr>
+                <w:sz w:val="20"/>
+                <w:szCs w:val="20"/>
+              </w:rPr>
             </w:pPr>
             <w:r>
+              <w:rPr>
+                <w:sz w:val="20"/>
+                <w:szCs w:val="20"/>
+              </w:rPr>
               <w:t>16</w:t>
             </w:r>
           </w:p>
@@ -630,8 +730,17 @@
           <w:p>
             <w:pPr>
               <w:pStyle w:val="Compact"/>
+              <w:keepNext/>
+              <w:rPr>
+                <w:sz w:val="20"/>
+                <w:szCs w:val="20"/>
+              </w:rPr>
             </w:pPr>
             <w:r>
+              <w:rPr>
+                <w:sz w:val="20"/>
+                <w:szCs w:val="20"/>
+              </w:rPr>
               <w:t>2026-02-18 14:35:11</w:t>
             </w:r>
           </w:p>
@@ -643,8 +752,17 @@
           <w:p>
             <w:pPr>
               <w:pStyle w:val="Compact"/>
+              <w:keepNext/>
+              <w:rPr>
+                <w:sz w:val="20"/>
+                <w:szCs w:val="20"/>
+              </w:rPr>
             </w:pPr>
             <w:r>
+              <w:rPr>
+                <w:sz w:val="20"/>
+                <w:szCs w:val="20"/>
+              </w:rPr>
               <w:t>admin_lookup_find_by_name</w:t>
             </w:r>
           </w:p>
@@ -656,9 +774,18 @@
           <w:p>
             <w:pPr>
               <w:pStyle w:val="Compact"/>
+              <w:keepNext/>
               <w:jc w:val="right"/>
+              <w:rPr>
+                <w:sz w:val="20"/>
+                <w:szCs w:val="20"/>
+              </w:rPr>
             </w:pPr>
             <w:r>
+              <w:rPr>
+                <w:sz w:val="20"/>
+                <w:szCs w:val="20"/>
+              </w:rPr>
               <w:t>200</w:t>
             </w:r>
           </w:p>
@@ -670,9 +797,18 @@
           <w:p>
             <w:pPr>
               <w:pStyle w:val="Compact"/>
+              <w:keepNext/>
               <w:jc w:val="right"/>
+              <w:rPr>
+                <w:sz w:val="20"/>
+                <w:szCs w:val="20"/>
+              </w:rPr>
             </w:pPr>
             <w:r>
+              <w:rPr>
+                <w:sz w:val="20"/>
+                <w:szCs w:val="20"/>
+              </w:rPr>
               <w:t>3.776</w:t>
             </w:r>
           </w:p>
@@ -686,10 +822,18 @@
           <w:p>
             <w:pPr>
               <w:pStyle w:val="Compact"/>
+              <w:keepNext/>
               <w:jc w:val="right"/>
+              <w:rPr>
+                <w:sz w:val="20"/>
+                <w:szCs w:val="20"/>
+              </w:rPr>
             </w:pPr>
             <w:r>
-              <w:lastRenderedPageBreak/>
+              <w:rPr>
+                <w:sz w:val="20"/>
+                <w:szCs w:val="20"/>
+              </w:rPr>
               <w:t>17</w:t>
             </w:r>
           </w:p>
@@ -701,8 +845,17 @@
           <w:p>
             <w:pPr>
               <w:pStyle w:val="Compact"/>
+              <w:keepNext/>
+              <w:rPr>
+                <w:sz w:val="20"/>
+                <w:szCs w:val="20"/>
+              </w:rPr>
             </w:pPr>
             <w:r>
+              <w:rPr>
+                <w:sz w:val="20"/>
+                <w:szCs w:val="20"/>
+              </w:rPr>
               <w:t>2026-02-18 14:45:16</w:t>
             </w:r>
           </w:p>
@@ -714,8 +867,17 @@
           <w:p>
             <w:pPr>
               <w:pStyle w:val="Compact"/>
+              <w:keepNext/>
+              <w:rPr>
+                <w:sz w:val="20"/>
+                <w:szCs w:val="20"/>
+              </w:rPr>
             </w:pPr>
             <w:r>
+              <w:rPr>
+                <w:sz w:val="20"/>
+                <w:szCs w:val="20"/>
+              </w:rPr>
               <w:t>os_places_search</w:t>
             </w:r>
           </w:p>
@@ -727,9 +889,18 @@
           <w:p>
             <w:pPr>
               <w:pStyle w:val="Compact"/>
+              <w:keepNext/>
               <w:jc w:val="right"/>
+              <w:rPr>
+                <w:sz w:val="20"/>
+                <w:szCs w:val="20"/>
+              </w:rPr>
             </w:pPr>
             <w:r>
+              <w:rPr>
+                <w:sz w:val="20"/>
+                <w:szCs w:val="20"/>
+              </w:rPr>
               <w:t>200</w:t>
             </w:r>
           </w:p>
@@ -741,9 +912,18 @@
           <w:p>
             <w:pPr>
               <w:pStyle w:val="Compact"/>
+              <w:keepNext/>
               <w:jc w:val="right"/>
+              <w:rPr>
+                <w:sz w:val="20"/>
+                <w:szCs w:val="20"/>
+              </w:rPr>
             </w:pPr>
             <w:r>
+              <w:rPr>
+                <w:sz w:val="20"/>
+                <w:szCs w:val="20"/>
+              </w:rPr>
               <w:t>0.643</w:t>
             </w:r>
           </w:p>
@@ -757,9 +937,18 @@
           <w:p>
             <w:pPr>
               <w:pStyle w:val="Compact"/>
+              <w:keepNext/>
               <w:jc w:val="right"/>
+              <w:rPr>
+                <w:sz w:val="20"/>
+                <w:szCs w:val="20"/>
+              </w:rPr>
             </w:pPr>
             <w:r>
+              <w:rPr>
+                <w:sz w:val="20"/>
+                <w:szCs w:val="20"/>
+              </w:rPr>
               <w:t>18</w:t>
             </w:r>
           </w:p>
@@ -771,8 +960,17 @@
           <w:p>
             <w:pPr>
               <w:pStyle w:val="Compact"/>
+              <w:keepNext/>
+              <w:rPr>
+                <w:sz w:val="20"/>
+                <w:szCs w:val="20"/>
+              </w:rPr>
             </w:pPr>
             <w:r>
+              <w:rPr>
+                <w:sz w:val="20"/>
+                <w:szCs w:val="20"/>
+              </w:rPr>
               <w:t>2026-02-18 14:45:20</w:t>
             </w:r>
           </w:p>
@@ -784,8 +982,17 @@
           <w:p>
             <w:pPr>
               <w:pStyle w:val="Compact"/>
+              <w:keepNext/>
+              <w:rPr>
+                <w:sz w:val="20"/>
+                <w:szCs w:val="20"/>
+              </w:rPr>
             </w:pPr>
             <w:r>
+              <w:rPr>
+                <w:sz w:val="20"/>
+                <w:szCs w:val="20"/>
+              </w:rPr>
               <w:t>os_poi_search</w:t>
             </w:r>
           </w:p>
@@ -797,9 +1004,18 @@
           <w:p>
             <w:pPr>
               <w:pStyle w:val="Compact"/>
+              <w:keepNext/>
               <w:jc w:val="right"/>
+              <w:rPr>
+                <w:sz w:val="20"/>
+                <w:szCs w:val="20"/>
+              </w:rPr>
             </w:pPr>
             <w:r>
+              <w:rPr>
+                <w:sz w:val="20"/>
+                <w:szCs w:val="20"/>
+              </w:rPr>
               <w:t>200</w:t>
             </w:r>
           </w:p>
@@ -811,9 +1027,18 @@
           <w:p>
             <w:pPr>
               <w:pStyle w:val="Compact"/>
+              <w:keepNext/>
               <w:jc w:val="right"/>
+              <w:rPr>
+                <w:sz w:val="20"/>
+                <w:szCs w:val="20"/>
+              </w:rPr>
             </w:pPr>
             <w:r>
+              <w:rPr>
+                <w:sz w:val="20"/>
+                <w:szCs w:val="20"/>
+              </w:rPr>
               <w:t>0.440</w:t>
             </w:r>
           </w:p>
@@ -827,9 +1052,18 @@
           <w:p>
             <w:pPr>
               <w:pStyle w:val="Compact"/>
+              <w:keepNext/>
               <w:jc w:val="right"/>
+              <w:rPr>
+                <w:sz w:val="20"/>
+                <w:szCs w:val="20"/>
+              </w:rPr>
             </w:pPr>
             <w:r>
+              <w:rPr>
+                <w:sz w:val="20"/>
+                <w:szCs w:val="20"/>
+              </w:rPr>
               <w:t>19</w:t>
             </w:r>
           </w:p>
@@ -841,8 +1075,17 @@
           <w:p>
             <w:pPr>
               <w:pStyle w:val="Compact"/>
+              <w:keepNext/>
+              <w:rPr>
+                <w:sz w:val="20"/>
+                <w:szCs w:val="20"/>
+              </w:rPr>
             </w:pPr>
             <w:r>
+              <w:rPr>
+                <w:sz w:val="20"/>
+                <w:szCs w:val="20"/>
+              </w:rPr>
               <w:t>2026-02-18 14:45:26</w:t>
             </w:r>
           </w:p>
@@ -854,8 +1097,17 @@
           <w:p>
             <w:pPr>
               <w:pStyle w:val="Compact"/>
+              <w:keepNext/>
+              <w:rPr>
+                <w:sz w:val="20"/>
+                <w:szCs w:val="20"/>
+              </w:rPr>
             </w:pPr>
             <w:r>
+              <w:rPr>
+                <w:sz w:val="20"/>
+                <w:szCs w:val="20"/>
+              </w:rPr>
               <w:t>admin_lookup_find_by_name</w:t>
             </w:r>
           </w:p>
@@ -867,9 +1119,18 @@
           <w:p>
             <w:pPr>
               <w:pStyle w:val="Compact"/>
+              <w:keepNext/>
               <w:jc w:val="right"/>
+              <w:rPr>
+                <w:sz w:val="20"/>
+                <w:szCs w:val="20"/>
+              </w:rPr>
             </w:pPr>
             <w:r>
+              <w:rPr>
+                <w:sz w:val="20"/>
+                <w:szCs w:val="20"/>
+              </w:rPr>
               <w:t>200</w:t>
             </w:r>
           </w:p>
@@ -881,9 +1142,18 @@
           <w:p>
             <w:pPr>
               <w:pStyle w:val="Compact"/>
+              <w:keepNext/>
               <w:jc w:val="right"/>
+              <w:rPr>
+                <w:sz w:val="20"/>
+                <w:szCs w:val="20"/>
+              </w:rPr>
             </w:pPr>
             <w:r>
+              <w:rPr>
+                <w:sz w:val="20"/>
+                <w:szCs w:val="20"/>
+              </w:rPr>
               <w:t>6.372</w:t>
             </w:r>
           </w:p>
@@ -897,9 +1167,18 @@
           <w:p>
             <w:pPr>
               <w:pStyle w:val="Compact"/>
+              <w:keepNext/>
               <w:jc w:val="right"/>
+              <w:rPr>
+                <w:sz w:val="20"/>
+                <w:szCs w:val="20"/>
+              </w:rPr>
             </w:pPr>
             <w:r>
+              <w:rPr>
+                <w:sz w:val="20"/>
+                <w:szCs w:val="20"/>
+              </w:rPr>
               <w:t>20</w:t>
             </w:r>
           </w:p>
@@ -911,8 +1190,17 @@
           <w:p>
             <w:pPr>
               <w:pStyle w:val="Compact"/>
+              <w:keepNext/>
+              <w:rPr>
+                <w:sz w:val="20"/>
+                <w:szCs w:val="20"/>
+              </w:rPr>
             </w:pPr>
             <w:r>
+              <w:rPr>
+                <w:sz w:val="20"/>
+                <w:szCs w:val="20"/>
+              </w:rPr>
               <w:t>2026-02-18 14:45:35</w:t>
             </w:r>
           </w:p>
@@ -924,8 +1212,17 @@
           <w:p>
             <w:pPr>
               <w:pStyle w:val="Compact"/>
+              <w:keepNext/>
+              <w:rPr>
+                <w:sz w:val="20"/>
+                <w:szCs w:val="20"/>
+              </w:rPr>
             </w:pPr>
             <w:r>
+              <w:rPr>
+                <w:sz w:val="20"/>
+                <w:szCs w:val="20"/>
+              </w:rPr>
               <w:t>admin_lookup_area_geometry</w:t>
             </w:r>
           </w:p>
@@ -937,9 +1234,18 @@
           <w:p>
             <w:pPr>
               <w:pStyle w:val="Compact"/>
+              <w:keepNext/>
               <w:jc w:val="right"/>
+              <w:rPr>
+                <w:sz w:val="20"/>
+                <w:szCs w:val="20"/>
+              </w:rPr>
             </w:pPr>
             <w:r>
+              <w:rPr>
+                <w:sz w:val="20"/>
+                <w:szCs w:val="20"/>
+              </w:rPr>
               <w:t>200</w:t>
             </w:r>
           </w:p>
@@ -951,9 +1257,18 @@
           <w:p>
             <w:pPr>
               <w:pStyle w:val="Compact"/>
+              <w:keepNext/>
               <w:jc w:val="right"/>
+              <w:rPr>
+                <w:sz w:val="20"/>
+                <w:szCs w:val="20"/>
+              </w:rPr>
             </w:pPr>
             <w:r>
+              <w:rPr>
+                <w:sz w:val="20"/>
+                <w:szCs w:val="20"/>
+              </w:rPr>
               <w:t>2.240</w:t>
             </w:r>
           </w:p>
@@ -967,9 +1282,18 @@
           <w:p>
             <w:pPr>
               <w:pStyle w:val="Compact"/>
+              <w:keepNext/>
               <w:jc w:val="right"/>
+              <w:rPr>
+                <w:sz w:val="20"/>
+                <w:szCs w:val="20"/>
+              </w:rPr>
             </w:pPr>
             <w:r>
+              <w:rPr>
+                <w:sz w:val="20"/>
+                <w:szCs w:val="20"/>
+              </w:rPr>
               <w:t>21</w:t>
             </w:r>
           </w:p>
@@ -981,8 +1305,17 @@
           <w:p>
             <w:pPr>
               <w:pStyle w:val="Compact"/>
+              <w:keepNext/>
+              <w:rPr>
+                <w:sz w:val="20"/>
+                <w:szCs w:val="20"/>
+              </w:rPr>
             </w:pPr>
             <w:r>
+              <w:rPr>
+                <w:sz w:val="20"/>
+                <w:szCs w:val="20"/>
+              </w:rPr>
               <w:t>2026-02-18 14:45:47</w:t>
             </w:r>
           </w:p>
@@ -994,8 +1327,17 @@
           <w:p>
             <w:pPr>
               <w:pStyle w:val="Compact"/>
+              <w:keepNext/>
+              <w:rPr>
+                <w:sz w:val="20"/>
+                <w:szCs w:val="20"/>
+              </w:rPr>
             </w:pPr>
             <w:r>
+              <w:rPr>
+                <w:sz w:val="20"/>
+                <w:szCs w:val="20"/>
+              </w:rPr>
               <w:t>os_features_collections</w:t>
             </w:r>
           </w:p>
@@ -1007,9 +1349,18 @@
           <w:p>
             <w:pPr>
               <w:pStyle w:val="Compact"/>
+              <w:keepNext/>
               <w:jc w:val="right"/>
+              <w:rPr>
+                <w:sz w:val="20"/>
+                <w:szCs w:val="20"/>
+              </w:rPr>
             </w:pPr>
             <w:r>
+              <w:rPr>
+                <w:sz w:val="20"/>
+                <w:szCs w:val="20"/>
+              </w:rPr>
               <w:t>200</w:t>
             </w:r>
           </w:p>
@@ -1021,9 +1372,18 @@
           <w:p>
             <w:pPr>
               <w:pStyle w:val="Compact"/>
+              <w:keepNext/>
               <w:jc w:val="right"/>
+              <w:rPr>
+                <w:sz w:val="20"/>
+                <w:szCs w:val="20"/>
+              </w:rPr>
             </w:pPr>
             <w:r>
+              <w:rPr>
+                <w:sz w:val="20"/>
+                <w:szCs w:val="20"/>
+              </w:rPr>
               <w:t>0.640</w:t>
             </w:r>
           </w:p>
@@ -1037,9 +1397,18 @@
           <w:p>
             <w:pPr>
               <w:pStyle w:val="Compact"/>
+              <w:keepNext/>
               <w:jc w:val="right"/>
+              <w:rPr>
+                <w:sz w:val="20"/>
+                <w:szCs w:val="20"/>
+              </w:rPr>
             </w:pPr>
             <w:r>
+              <w:rPr>
+                <w:sz w:val="20"/>
+                <w:szCs w:val="20"/>
+              </w:rPr>
               <w:t>22</w:t>
             </w:r>
           </w:p>
@@ -1051,8 +1420,17 @@
           <w:p>
             <w:pPr>
               <w:pStyle w:val="Compact"/>
+              <w:keepNext/>
+              <w:rPr>
+                <w:sz w:val="20"/>
+                <w:szCs w:val="20"/>
+              </w:rPr>
             </w:pPr>
             <w:r>
+              <w:rPr>
+                <w:sz w:val="20"/>
+                <w:szCs w:val="20"/>
+              </w:rPr>
               <w:t>2026-02-18 14:46:40</w:t>
             </w:r>
           </w:p>
@@ -1064,8 +1442,17 @@
           <w:p>
             <w:pPr>
               <w:pStyle w:val="Compact"/>
+              <w:keepNext/>
+              <w:rPr>
+                <w:sz w:val="20"/>
+                <w:szCs w:val="20"/>
+              </w:rPr>
             </w:pPr>
             <w:r>
+              <w:rPr>
+                <w:sz w:val="20"/>
+                <w:szCs w:val="20"/>
+              </w:rPr>
               <w:t>os_features_query</w:t>
             </w:r>
           </w:p>
@@ -1077,9 +1464,18 @@
           <w:p>
             <w:pPr>
               <w:pStyle w:val="Compact"/>
+              <w:keepNext/>
               <w:jc w:val="right"/>
+              <w:rPr>
+                <w:sz w:val="20"/>
+                <w:szCs w:val="20"/>
+              </w:rPr>
             </w:pPr>
             <w:r>
+              <w:rPr>
+                <w:sz w:val="20"/>
+                <w:szCs w:val="20"/>
+              </w:rPr>
               <w:t>200</w:t>
             </w:r>
           </w:p>
@@ -1091,9 +1487,18 @@
           <w:p>
             <w:pPr>
               <w:pStyle w:val="Compact"/>
+              <w:keepNext/>
               <w:jc w:val="right"/>
+              <w:rPr>
+                <w:sz w:val="20"/>
+                <w:szCs w:val="20"/>
+              </w:rPr>
             </w:pPr>
             <w:r>
+              <w:rPr>
+                <w:sz w:val="20"/>
+                <w:szCs w:val="20"/>
+              </w:rPr>
               <w:t>11.468</w:t>
             </w:r>
           </w:p>
@@ -1107,9 +1512,18 @@
           <w:p>
             <w:pPr>
               <w:pStyle w:val="Compact"/>
+              <w:keepNext/>
               <w:jc w:val="right"/>
+              <w:rPr>
+                <w:sz w:val="20"/>
+                <w:szCs w:val="20"/>
+              </w:rPr>
             </w:pPr>
             <w:r>
+              <w:rPr>
+                <w:sz w:val="20"/>
+                <w:szCs w:val="20"/>
+              </w:rPr>
               <w:t>23</w:t>
             </w:r>
           </w:p>
@@ -1121,8 +1535,17 @@
           <w:p>
             <w:pPr>
               <w:pStyle w:val="Compact"/>
+              <w:keepNext/>
+              <w:rPr>
+                <w:sz w:val="20"/>
+                <w:szCs w:val="20"/>
+              </w:rPr>
             </w:pPr>
             <w:r>
+              <w:rPr>
+                <w:sz w:val="20"/>
+                <w:szCs w:val="20"/>
+              </w:rPr>
               <w:t>2026-02-18 14:47:12</w:t>
             </w:r>
           </w:p>
@@ -1134,8 +1557,17 @@
           <w:p>
             <w:pPr>
               <w:pStyle w:val="Compact"/>
+              <w:keepNext/>
+              <w:rPr>
+                <w:sz w:val="20"/>
+                <w:szCs w:val="20"/>
+              </w:rPr>
             </w:pPr>
             <w:r>
+              <w:rPr>
+                <w:sz w:val="20"/>
+                <w:szCs w:val="20"/>
+              </w:rPr>
               <w:t>os_features_query</w:t>
             </w:r>
           </w:p>
@@ -1147,9 +1579,18 @@
           <w:p>
             <w:pPr>
               <w:pStyle w:val="Compact"/>
+              <w:keepNext/>
               <w:jc w:val="right"/>
+              <w:rPr>
+                <w:sz w:val="20"/>
+                <w:szCs w:val="20"/>
+              </w:rPr>
             </w:pPr>
             <w:r>
+              <w:rPr>
+                <w:sz w:val="20"/>
+                <w:szCs w:val="20"/>
+              </w:rPr>
               <w:t>200</w:t>
             </w:r>
           </w:p>
@@ -1161,9 +1602,18 @@
           <w:p>
             <w:pPr>
               <w:pStyle w:val="Compact"/>
+              <w:keepNext/>
               <w:jc w:val="right"/>
+              <w:rPr>
+                <w:sz w:val="20"/>
+                <w:szCs w:val="20"/>
+              </w:rPr>
             </w:pPr>
             <w:r>
+              <w:rPr>
+                <w:sz w:val="20"/>
+                <w:szCs w:val="20"/>
+              </w:rPr>
               <w:t>1.305</w:t>
             </w:r>
           </w:p>
@@ -1177,9 +1627,18 @@
           <w:p>
             <w:pPr>
               <w:pStyle w:val="Compact"/>
+              <w:keepNext/>
               <w:jc w:val="right"/>
+              <w:rPr>
+                <w:sz w:val="20"/>
+                <w:szCs w:val="20"/>
+              </w:rPr>
             </w:pPr>
             <w:r>
+              <w:rPr>
+                <w:sz w:val="20"/>
+                <w:szCs w:val="20"/>
+              </w:rPr>
               <w:t>24</w:t>
             </w:r>
           </w:p>
@@ -1191,8 +1650,17 @@
           <w:p>
             <w:pPr>
               <w:pStyle w:val="Compact"/>
+              <w:keepNext/>
+              <w:rPr>
+                <w:sz w:val="20"/>
+                <w:szCs w:val="20"/>
+              </w:rPr>
             </w:pPr>
             <w:r>
+              <w:rPr>
+                <w:sz w:val="20"/>
+                <w:szCs w:val="20"/>
+              </w:rPr>
               <w:t>2026-02-18 14:47:20</w:t>
             </w:r>
           </w:p>
@@ -1204,8 +1672,17 @@
           <w:p>
             <w:pPr>
               <w:pStyle w:val="Compact"/>
+              <w:keepNext/>
+              <w:rPr>
+                <w:sz w:val="20"/>
+                <w:szCs w:val="20"/>
+              </w:rPr>
             </w:pPr>
             <w:r>
+              <w:rPr>
+                <w:sz w:val="20"/>
+                <w:szCs w:val="20"/>
+              </w:rPr>
               <w:t>os_features_query</w:t>
             </w:r>
           </w:p>
@@ -1217,9 +1694,18 @@
           <w:p>
             <w:pPr>
               <w:pStyle w:val="Compact"/>
+              <w:keepNext/>
               <w:jc w:val="right"/>
+              <w:rPr>
+                <w:sz w:val="20"/>
+                <w:szCs w:val="20"/>
+              </w:rPr>
             </w:pPr>
             <w:r>
+              <w:rPr>
+                <w:sz w:val="20"/>
+                <w:szCs w:val="20"/>
+              </w:rPr>
               <w:t>200</w:t>
             </w:r>
           </w:p>
@@ -1231,9 +1717,18 @@
           <w:p>
             <w:pPr>
               <w:pStyle w:val="Compact"/>
+              <w:keepNext/>
               <w:jc w:val="right"/>
+              <w:rPr>
+                <w:sz w:val="20"/>
+                <w:szCs w:val="20"/>
+              </w:rPr>
             </w:pPr>
             <w:r>
+              <w:rPr>
+                <w:sz w:val="20"/>
+                <w:szCs w:val="20"/>
+              </w:rPr>
               <w:t>1.184</w:t>
             </w:r>
           </w:p>
@@ -1247,9 +1742,18 @@
           <w:p>
             <w:pPr>
               <w:pStyle w:val="Compact"/>
+              <w:keepNext/>
               <w:jc w:val="right"/>
+              <w:rPr>
+                <w:sz w:val="20"/>
+                <w:szCs w:val="20"/>
+              </w:rPr>
             </w:pPr>
             <w:r>
+              <w:rPr>
+                <w:sz w:val="20"/>
+                <w:szCs w:val="20"/>
+              </w:rPr>
               <w:t>25</w:t>
             </w:r>
           </w:p>
@@ -1261,8 +1765,17 @@
           <w:p>
             <w:pPr>
               <w:pStyle w:val="Compact"/>
+              <w:keepNext/>
+              <w:rPr>
+                <w:sz w:val="20"/>
+                <w:szCs w:val="20"/>
+              </w:rPr>
             </w:pPr>
             <w:r>
+              <w:rPr>
+                <w:sz w:val="20"/>
+                <w:szCs w:val="20"/>
+              </w:rPr>
               <w:t>2026-02-18 14:47:40</w:t>
             </w:r>
           </w:p>
@@ -1274,8 +1787,17 @@
           <w:p>
             <w:pPr>
               <w:pStyle w:val="Compact"/>
+              <w:keepNext/>
+              <w:rPr>
+                <w:sz w:val="20"/>
+                <w:szCs w:val="20"/>
+              </w:rPr>
             </w:pPr>
             <w:r>
+              <w:rPr>
+                <w:sz w:val="20"/>
+                <w:szCs w:val="20"/>
+              </w:rPr>
               <w:t>os_features_query</w:t>
             </w:r>
           </w:p>
@@ -1287,9 +1809,18 @@
           <w:p>
             <w:pPr>
               <w:pStyle w:val="Compact"/>
+              <w:keepNext/>
               <w:jc w:val="right"/>
+              <w:rPr>
+                <w:sz w:val="20"/>
+                <w:szCs w:val="20"/>
+              </w:rPr>
             </w:pPr>
             <w:r>
+              <w:rPr>
+                <w:sz w:val="20"/>
+                <w:szCs w:val="20"/>
+              </w:rPr>
               <w:t>501</w:t>
             </w:r>
           </w:p>
@@ -1301,9 +1832,18 @@
           <w:p>
             <w:pPr>
               <w:pStyle w:val="Compact"/>
+              <w:keepNext/>
               <w:jc w:val="right"/>
+              <w:rPr>
+                <w:sz w:val="20"/>
+                <w:szCs w:val="20"/>
+              </w:rPr>
             </w:pPr>
             <w:r>
+              <w:rPr>
+                <w:sz w:val="20"/>
+                <w:szCs w:val="20"/>
+              </w:rPr>
               <w:t>15.624</w:t>
             </w:r>
           </w:p>
@@ -1317,9 +1857,18 @@
           <w:p>
             <w:pPr>
               <w:pStyle w:val="Compact"/>
+              <w:keepNext/>
               <w:jc w:val="right"/>
+              <w:rPr>
+                <w:sz w:val="20"/>
+                <w:szCs w:val="20"/>
+              </w:rPr>
             </w:pPr>
             <w:r>
+              <w:rPr>
+                <w:sz w:val="20"/>
+                <w:szCs w:val="20"/>
+              </w:rPr>
               <w:t>26</w:t>
             </w:r>
           </w:p>
@@ -1331,8 +1880,17 @@
           <w:p>
             <w:pPr>
               <w:pStyle w:val="Compact"/>
+              <w:keepNext/>
+              <w:rPr>
+                <w:sz w:val="20"/>
+                <w:szCs w:val="20"/>
+              </w:rPr>
             </w:pPr>
             <w:r>
+              <w:rPr>
+                <w:sz w:val="20"/>
+                <w:szCs w:val="20"/>
+              </w:rPr>
               <w:t>2026-02-18 14:47:58</w:t>
             </w:r>
           </w:p>
@@ -1344,8 +1902,17 @@
           <w:p>
             <w:pPr>
               <w:pStyle w:val="Compact"/>
+              <w:keepNext/>
+              <w:rPr>
+                <w:sz w:val="20"/>
+                <w:szCs w:val="20"/>
+              </w:rPr>
             </w:pPr>
             <w:r>
+              <w:rPr>
+                <w:sz w:val="20"/>
+                <w:szCs w:val="20"/>
+              </w:rPr>
               <w:t>os_features_query</w:t>
             </w:r>
           </w:p>
@@ -1357,9 +1924,18 @@
           <w:p>
             <w:pPr>
               <w:pStyle w:val="Compact"/>
+              <w:keepNext/>
               <w:jc w:val="right"/>
+              <w:rPr>
+                <w:sz w:val="20"/>
+                <w:szCs w:val="20"/>
+              </w:rPr>
             </w:pPr>
             <w:r>
+              <w:rPr>
+                <w:sz w:val="20"/>
+                <w:szCs w:val="20"/>
+              </w:rPr>
               <w:t>200</w:t>
             </w:r>
           </w:p>
@@ -1371,9 +1947,18 @@
           <w:p>
             <w:pPr>
               <w:pStyle w:val="Compact"/>
+              <w:keepNext/>
               <w:jc w:val="right"/>
+              <w:rPr>
+                <w:sz w:val="20"/>
+                <w:szCs w:val="20"/>
+              </w:rPr>
             </w:pPr>
             <w:r>
+              <w:rPr>
+                <w:sz w:val="20"/>
+                <w:szCs w:val="20"/>
+              </w:rPr>
               <w:t>1.361</w:t>
             </w:r>
           </w:p>
@@ -1387,9 +1972,18 @@
           <w:p>
             <w:pPr>
               <w:pStyle w:val="Compact"/>
+              <w:keepNext/>
               <w:jc w:val="right"/>
+              <w:rPr>
+                <w:sz w:val="20"/>
+                <w:szCs w:val="20"/>
+              </w:rPr>
             </w:pPr>
             <w:r>
+              <w:rPr>
+                <w:sz w:val="20"/>
+                <w:szCs w:val="20"/>
+              </w:rPr>
               <w:t>27</w:t>
             </w:r>
           </w:p>
@@ -1401,8 +1995,17 @@
           <w:p>
             <w:pPr>
               <w:pStyle w:val="Compact"/>
+              <w:keepNext/>
+              <w:rPr>
+                <w:sz w:val="20"/>
+                <w:szCs w:val="20"/>
+              </w:rPr>
             </w:pPr>
             <w:r>
+              <w:rPr>
+                <w:sz w:val="20"/>
+                <w:szCs w:val="20"/>
+              </w:rPr>
               <w:t>2026-02-18 14:48:16</w:t>
             </w:r>
           </w:p>
@@ -1414,8 +2017,17 @@
           <w:p>
             <w:pPr>
               <w:pStyle w:val="Compact"/>
+              <w:keepNext/>
+              <w:rPr>
+                <w:sz w:val="20"/>
+                <w:szCs w:val="20"/>
+              </w:rPr>
             </w:pPr>
             <w:r>
+              <w:rPr>
+                <w:sz w:val="20"/>
+                <w:szCs w:val="20"/>
+              </w:rPr>
               <w:t>os_features_query</w:t>
             </w:r>
           </w:p>
@@ -1427,9 +2039,18 @@
           <w:p>
             <w:pPr>
               <w:pStyle w:val="Compact"/>
+              <w:keepNext/>
               <w:jc w:val="right"/>
+              <w:rPr>
+                <w:sz w:val="20"/>
+                <w:szCs w:val="20"/>
+              </w:rPr>
             </w:pPr>
             <w:r>
+              <w:rPr>
+                <w:sz w:val="20"/>
+                <w:szCs w:val="20"/>
+              </w:rPr>
               <w:t>200</w:t>
             </w:r>
           </w:p>
@@ -1441,9 +2062,18 @@
           <w:p>
             <w:pPr>
               <w:pStyle w:val="Compact"/>
+              <w:keepNext/>
               <w:jc w:val="right"/>
+              <w:rPr>
+                <w:sz w:val="20"/>
+                <w:szCs w:val="20"/>
+              </w:rPr>
             </w:pPr>
             <w:r>
+              <w:rPr>
+                <w:sz w:val="20"/>
+                <w:szCs w:val="20"/>
+              </w:rPr>
               <w:t>1.363</w:t>
             </w:r>
           </w:p>
@@ -1457,9 +2087,18 @@
           <w:p>
             <w:pPr>
               <w:pStyle w:val="Compact"/>
+              <w:keepNext/>
               <w:jc w:val="right"/>
+              <w:rPr>
+                <w:sz w:val="20"/>
+                <w:szCs w:val="20"/>
+              </w:rPr>
             </w:pPr>
             <w:r>
+              <w:rPr>
+                <w:sz w:val="20"/>
+                <w:szCs w:val="20"/>
+              </w:rPr>
               <w:t>28</w:t>
             </w:r>
           </w:p>
@@ -1471,8 +2110,17 @@
           <w:p>
             <w:pPr>
               <w:pStyle w:val="Compact"/>
+              <w:keepNext/>
+              <w:rPr>
+                <w:sz w:val="20"/>
+                <w:szCs w:val="20"/>
+              </w:rPr>
             </w:pPr>
             <w:r>
+              <w:rPr>
+                <w:sz w:val="20"/>
+                <w:szCs w:val="20"/>
+              </w:rPr>
               <w:t>2026-02-18 14:48:33</w:t>
             </w:r>
           </w:p>
@@ -1484,8 +2132,17 @@
           <w:p>
             <w:pPr>
               <w:pStyle w:val="Compact"/>
+              <w:keepNext/>
+              <w:rPr>
+                <w:sz w:val="20"/>
+                <w:szCs w:val="20"/>
+              </w:rPr>
             </w:pPr>
             <w:r>
+              <w:rPr>
+                <w:sz w:val="20"/>
+                <w:szCs w:val="20"/>
+              </w:rPr>
               <w:t>os_features_query</w:t>
             </w:r>
           </w:p>
@@ -1497,9 +2154,18 @@
           <w:p>
             <w:pPr>
               <w:pStyle w:val="Compact"/>
+              <w:keepNext/>
               <w:jc w:val="right"/>
+              <w:rPr>
+                <w:sz w:val="20"/>
+                <w:szCs w:val="20"/>
+              </w:rPr>
             </w:pPr>
             <w:r>
+              <w:rPr>
+                <w:sz w:val="20"/>
+                <w:szCs w:val="20"/>
+              </w:rPr>
               <w:t>200</w:t>
             </w:r>
           </w:p>
@@ -1511,9 +2177,18 @@
           <w:p>
             <w:pPr>
               <w:pStyle w:val="Compact"/>
+              <w:keepNext/>
               <w:jc w:val="right"/>
+              <w:rPr>
+                <w:sz w:val="20"/>
+                <w:szCs w:val="20"/>
+              </w:rPr>
             </w:pPr>
             <w:r>
+              <w:rPr>
+                <w:sz w:val="20"/>
+                <w:szCs w:val="20"/>
+              </w:rPr>
               <w:t>1.759</w:t>
             </w:r>
           </w:p>
@@ -1527,9 +2202,18 @@
           <w:p>
             <w:pPr>
               <w:pStyle w:val="Compact"/>
+              <w:keepNext/>
               <w:jc w:val="right"/>
+              <w:rPr>
+                <w:sz w:val="20"/>
+                <w:szCs w:val="20"/>
+              </w:rPr>
             </w:pPr>
             <w:r>
+              <w:rPr>
+                <w:sz w:val="20"/>
+                <w:szCs w:val="20"/>
+              </w:rPr>
               <w:t>29</w:t>
             </w:r>
           </w:p>
@@ -1541,8 +2225,17 @@
           <w:p>
             <w:pPr>
               <w:pStyle w:val="Compact"/>
+              <w:keepNext/>
+              <w:rPr>
+                <w:sz w:val="20"/>
+                <w:szCs w:val="20"/>
+              </w:rPr>
             </w:pPr>
             <w:r>
+              <w:rPr>
+                <w:sz w:val="20"/>
+                <w:szCs w:val="20"/>
+              </w:rPr>
               <w:t>2026-02-18 14:49:12</w:t>
             </w:r>
           </w:p>
@@ -1554,8 +2247,17 @@
           <w:p>
             <w:pPr>
               <w:pStyle w:val="Compact"/>
+              <w:keepNext/>
+              <w:rPr>
+                <w:sz w:val="20"/>
+                <w:szCs w:val="20"/>
+              </w:rPr>
             </w:pPr>
             <w:r>
+              <w:rPr>
+                <w:sz w:val="20"/>
+                <w:szCs w:val="20"/>
+              </w:rPr>
               <w:t>os_features_query</w:t>
             </w:r>
           </w:p>
@@ -1567,9 +2269,18 @@
           <w:p>
             <w:pPr>
               <w:pStyle w:val="Compact"/>
+              <w:keepNext/>
               <w:jc w:val="right"/>
+              <w:rPr>
+                <w:sz w:val="20"/>
+                <w:szCs w:val="20"/>
+              </w:rPr>
             </w:pPr>
             <w:r>
+              <w:rPr>
+                <w:sz w:val="20"/>
+                <w:szCs w:val="20"/>
+              </w:rPr>
               <w:t>200</w:t>
             </w:r>
           </w:p>
@@ -1581,9 +2292,18 @@
           <w:p>
             <w:pPr>
               <w:pStyle w:val="Compact"/>
+              <w:keepNext/>
               <w:jc w:val="right"/>
+              <w:rPr>
+                <w:sz w:val="20"/>
+                <w:szCs w:val="20"/>
+              </w:rPr>
             </w:pPr>
             <w:r>
+              <w:rPr>
+                <w:sz w:val="20"/>
+                <w:szCs w:val="20"/>
+              </w:rPr>
               <w:t>13.989</w:t>
             </w:r>
           </w:p>
@@ -1597,9 +2317,18 @@
           <w:p>
             <w:pPr>
               <w:pStyle w:val="Compact"/>
+              <w:keepNext/>
               <w:jc w:val="right"/>
+              <w:rPr>
+                <w:sz w:val="20"/>
+                <w:szCs w:val="20"/>
+              </w:rPr>
             </w:pPr>
             <w:r>
+              <w:rPr>
+                <w:sz w:val="20"/>
+                <w:szCs w:val="20"/>
+              </w:rPr>
               <w:t>30</w:t>
             </w:r>
           </w:p>
@@ -1611,8 +2340,17 @@
           <w:p>
             <w:pPr>
               <w:pStyle w:val="Compact"/>
+              <w:keepNext/>
+              <w:rPr>
+                <w:sz w:val="20"/>
+                <w:szCs w:val="20"/>
+              </w:rPr>
             </w:pPr>
             <w:r>
+              <w:rPr>
+                <w:sz w:val="20"/>
+                <w:szCs w:val="20"/>
+              </w:rPr>
               <w:t>2026-02-18 14:49:40</w:t>
             </w:r>
           </w:p>
@@ -1624,8 +2362,17 @@
           <w:p>
             <w:pPr>
               <w:pStyle w:val="Compact"/>
+              <w:keepNext/>
+              <w:rPr>
+                <w:sz w:val="20"/>
+                <w:szCs w:val="20"/>
+              </w:rPr>
             </w:pPr>
             <w:r>
+              <w:rPr>
+                <w:sz w:val="20"/>
+                <w:szCs w:val="20"/>
+              </w:rPr>
               <w:t>os_features_query</w:t>
             </w:r>
           </w:p>
@@ -1637,9 +2384,18 @@
           <w:p>
             <w:pPr>
               <w:pStyle w:val="Compact"/>
+              <w:keepNext/>
               <w:jc w:val="right"/>
+              <w:rPr>
+                <w:sz w:val="20"/>
+                <w:szCs w:val="20"/>
+              </w:rPr>
             </w:pPr>
             <w:r>
+              <w:rPr>
+                <w:sz w:val="20"/>
+                <w:szCs w:val="20"/>
+              </w:rPr>
               <w:t>200</w:t>
             </w:r>
           </w:p>
@@ -1651,9 +2407,18 @@
           <w:p>
             <w:pPr>
               <w:pStyle w:val="Compact"/>
+              <w:keepNext/>
               <w:jc w:val="right"/>
+              <w:rPr>
+                <w:sz w:val="20"/>
+                <w:szCs w:val="20"/>
+              </w:rPr>
             </w:pPr>
             <w:r>
+              <w:rPr>
+                <w:sz w:val="20"/>
+                <w:szCs w:val="20"/>
+              </w:rPr>
               <w:t>2.495</w:t>
             </w:r>
           </w:p>
@@ -1667,9 +2432,18 @@
           <w:p>
             <w:pPr>
               <w:pStyle w:val="Compact"/>
+              <w:keepNext/>
               <w:jc w:val="right"/>
+              <w:rPr>
+                <w:sz w:val="20"/>
+                <w:szCs w:val="20"/>
+              </w:rPr>
             </w:pPr>
             <w:r>
+              <w:rPr>
+                <w:sz w:val="20"/>
+                <w:szCs w:val="20"/>
+              </w:rPr>
               <w:t>31</w:t>
             </w:r>
           </w:p>
@@ -1681,8 +2455,17 @@
           <w:p>
             <w:pPr>
               <w:pStyle w:val="Compact"/>
+              <w:keepNext/>
+              <w:rPr>
+                <w:sz w:val="20"/>
+                <w:szCs w:val="20"/>
+              </w:rPr>
             </w:pPr>
             <w:r>
+              <w:rPr>
+                <w:sz w:val="20"/>
+                <w:szCs w:val="20"/>
+              </w:rPr>
               <w:t>2026-02-18 14:50:24</w:t>
             </w:r>
           </w:p>
@@ -1694,8 +2477,17 @@
           <w:p>
             <w:pPr>
               <w:pStyle w:val="Compact"/>
+              <w:keepNext/>
+              <w:rPr>
+                <w:sz w:val="20"/>
+                <w:szCs w:val="20"/>
+              </w:rPr>
             </w:pPr>
             <w:r>
+              <w:rPr>
+                <w:sz w:val="20"/>
+                <w:szCs w:val="20"/>
+              </w:rPr>
               <w:t>os_features_query</w:t>
             </w:r>
           </w:p>
@@ -1707,9 +2499,18 @@
           <w:p>
             <w:pPr>
               <w:pStyle w:val="Compact"/>
+              <w:keepNext/>
               <w:jc w:val="right"/>
+              <w:rPr>
+                <w:sz w:val="20"/>
+                <w:szCs w:val="20"/>
+              </w:rPr>
             </w:pPr>
             <w:r>
+              <w:rPr>
+                <w:sz w:val="20"/>
+                <w:szCs w:val="20"/>
+              </w:rPr>
               <w:t>200</w:t>
             </w:r>
           </w:p>
@@ -1721,9 +2522,18 @@
           <w:p>
             <w:pPr>
               <w:pStyle w:val="Compact"/>
+              <w:keepNext/>
               <w:jc w:val="right"/>
+              <w:rPr>
+                <w:sz w:val="20"/>
+                <w:szCs w:val="20"/>
+              </w:rPr>
             </w:pPr>
             <w:r>
+              <w:rPr>
+                <w:sz w:val="20"/>
+                <w:szCs w:val="20"/>
+              </w:rPr>
               <w:t>317.381</w:t>
             </w:r>
           </w:p>
@@ -2650,6 +3460,7 @@
         <w:rPr>
           <w:rStyle w:val="VerbatimChar"/>
         </w:rPr>
+        <w:lastRenderedPageBreak/>
         <w:t>id=28</w:t>
       </w:r>
       <w:r>
@@ -2794,7 +3605,6 @@
         <w:rPr>
           <w:rStyle w:val="VerbatimChar"/>
         </w:rPr>
-        <w:lastRenderedPageBreak/>
         <w:t>includeGeometry=True</w:t>
       </w:r>
       <w:r>
@@ -3200,7 +4010,11 @@
         <w:t>Missing protected-landscape boundary layer</w:t>
       </w:r>
       <w:r>
-        <w:t xml:space="preserve"> Evidence: admin lookup for "Forest of Bowland" produced no results, and the workflow fell back to a ward named "Bowland". Impact: incorrect AOI polygon and high risk of surveying the wrong area. Likely cause (inference): no designated landscape boundary source (AONB/National Landscape) in the active flow, so "best available" became an electoral ward. Practical mitigation: add AONB boundary support via Natural England/Planning Data and/or provide NGD named-area lookup [12][13].</w:t>
+        <w:t xml:space="preserve"> Evidence: admin lookup for "Forest of Bowland" produced no results, and the workflow fell back to a ward named "Bowland". Impact: incorrect AOI polygon and high risk of surveying the wrong area. Likely cause (inference): no designated landscape boundary source (AONB/National Landscape) in the active flow, so "best available" </w:t>
+      </w:r>
+      <w:r>
+        <w:lastRenderedPageBreak/>
+        <w:t>became an electoral ward. Practical mitigation: add AONB boundary support via Natural England/Planning Data and/or provide NGD named-area lookup [12][13].</w:t>
       </w:r>
     </w:p>
     <w:p>
@@ -3227,11 +4041,7 @@
         <w:t>description='Peat'</w:t>
       </w:r>
       <w:r>
-        <w:t xml:space="preserve"> in a land-cover collection returned zero. Impact: false negatives and potentially misleading "no peat" conclusions. Likely cause: the dataset attribute does not directly encode peat presence; peat is a soil/condition class and land cover is proxy-only. Practical mitigation: prefer peat-specific </w:t>
-      </w:r>
-      <w:r>
-        <w:lastRenderedPageBreak/>
-        <w:t>datasets (England Peat Map) and/or structured habitat datasets (Priority Habitat Inventory) for peat relevance [2][7][8][9][10][11].</w:t>
+        <w:t xml:space="preserve"> in a land-cover collection returned zero. Impact: false negatives and potentially misleading "no peat" conclusions. Likely cause: the dataset attribute does not directly encode peat presence; peat is a soil/condition class and land cover is proxy-only. Practical mitigation: prefer peat-specific datasets (England Peat Map) and/or structured habitat datasets (Priority Habitat Inventory) for peat relevance [2][7][8][9][10][11].</w:t>
       </w:r>
     </w:p>
     <w:p>
@@ -3267,7 +4077,10 @@
         <w:t>numberReturned</w:t>
       </w:r>
       <w:r>
-        <w:t xml:space="preserve"> equal to requested limit (for example 100 or 50). Impact: broken pagination logic, broken QA checks, and misleading returned metrics. Likely cause (inference): </w:t>
+        <w:t xml:space="preserve"> equal to requested limit (for example 100 or 50). </w:t>
+      </w:r>
+      <w:r>
+        <w:t xml:space="preserve">Impact: broken pagination logic, broken QA checks, and misleading returned metrics. Likely cause (inference): </w:t>
       </w:r>
       <w:r>
         <w:rPr>
@@ -3498,6 +4311,7 @@
       <w:bookmarkEnd w:id="3"/>
       <w:bookmarkEnd w:id="6"/>
       <w:r>
+        <w:lastRenderedPageBreak/>
         <w:t>Section D: Proposed end-to-end survey workflow</w:t>
       </w:r>
     </w:p>
@@ -3609,7 +4423,6 @@
           <w:b/>
           <w:bCs/>
         </w:rPr>
-        <w:lastRenderedPageBreak/>
         <w:t>Hard caps</w:t>
       </w:r>
       <w:r>
@@ -3875,6 +4688,7 @@
         </w:numPr>
       </w:pPr>
       <w:r>
+        <w:lastRenderedPageBreak/>
         <w:t xml:space="preserve">Query relevant water collections with </w:t>
       </w:r>
       <w:r>
@@ -4011,7 +4825,6 @@
         </w:numPr>
       </w:pPr>
       <w:r>
-        <w:lastRenderedPageBreak/>
         <w:t>Use land polygons (</w:t>
       </w:r>
       <w:r>
@@ -4283,6 +5096,7 @@
         </w:numPr>
       </w:pPr>
       <w:r>
+        <w:lastRenderedPageBreak/>
         <w:t>Hydrology and land/habitat proxy layers extracted with paging control (or documented sampling).</w:t>
       </w:r>
     </w:p>
@@ -4423,175 +5237,175 @@
         </w:numPr>
       </w:pPr>
       <w:r>
+        <w:t>Name the AOI and the authority for its geometry (AONB boundary, named-area polygon, or explicit approximation).</w:t>
+      </w:r>
+    </w:p>
+    <w:p>
+      <w:pPr>
+        <w:pStyle w:val="Compact"/>
+        <w:numPr>
+          <w:ilvl w:val="0"/>
+          <w:numId w:val="17"/>
+        </w:numPr>
+      </w:pPr>
+      <w:r>
+        <w:t>Provide the centroid/representative point, bbox, and polygon provenance (licence/copyright terms if relevant).</w:t>
+      </w:r>
+    </w:p>
+    <w:p>
+      <w:pPr>
+        <w:pStyle w:val="Compact"/>
+        <w:numPr>
+          <w:ilvl w:val="0"/>
+          <w:numId w:val="17"/>
+        </w:numPr>
+      </w:pPr>
+      <w:r>
+        <w:t>Provide the operational AOI used for queries (possibly an AOI buffer for hydrology catchments).</w:t>
+      </w:r>
+    </w:p>
+    <w:p>
+      <w:pPr>
+        <w:pStyle w:val="FirstParagraph"/>
+      </w:pPr>
+      <w:r>
+        <w:rPr>
+          <w:b/>
+          <w:bCs/>
+        </w:rPr>
+        <w:t>Peat indicators</w:t>
+      </w:r>
+    </w:p>
+    <w:p>
+      <w:pPr>
+        <w:pStyle w:val="Compact"/>
+        <w:numPr>
+          <w:ilvl w:val="0"/>
+          <w:numId w:val="18"/>
+        </w:numPr>
+      </w:pPr>
+      <w:r>
+        <w:t>Primary evidence (where available): peat extent probability, peat depth, peat condition, erosion/drainage features (grips, gullies, haggs, bare peat), vegetation on peaty soil. England Peat Map explicitly models these layers [2][7][8][9][10][11].</w:t>
+      </w:r>
+    </w:p>
+    <w:p>
+      <w:pPr>
+        <w:pStyle w:val="Compact"/>
+        <w:numPr>
+          <w:ilvl w:val="0"/>
+          <w:numId w:val="18"/>
+        </w:numPr>
+      </w:pPr>
+      <w:r>
+        <w:t>Secondary evidence: Priority Habitat Inventory classes relevant to peat such as blanket bog, lowland raised bog, fens, upland flushes/fens/swamps (as corroboration or targeting).</w:t>
+      </w:r>
+    </w:p>
+    <w:p>
+      <w:pPr>
+        <w:pStyle w:val="Compact"/>
+        <w:numPr>
+          <w:ilvl w:val="0"/>
+          <w:numId w:val="18"/>
+        </w:numPr>
+      </w:pPr>
+      <w:r>
+        <w:t>Proxies: land-cover categories (heath/rough grassland, marsh), topographic wetness, headwater density, mapped water bodies.</w:t>
+      </w:r>
+    </w:p>
+    <w:p>
+      <w:pPr>
+        <w:pStyle w:val="FirstParagraph"/>
+      </w:pPr>
+      <w:r>
+        <w:rPr>
+          <w:b/>
+          <w:bCs/>
+        </w:rPr>
+        <w:t>Hydrology context</w:t>
+      </w:r>
+    </w:p>
+    <w:p>
+      <w:pPr>
+        <w:pStyle w:val="Compact"/>
+        <w:numPr>
+          <w:ilvl w:val="0"/>
+          <w:numId w:val="19"/>
+        </w:numPr>
+      </w:pPr>
+      <w:r>
+        <w:t>Summarise surface water abundance and pattern (water bodies, water links/nodes, springs/ponds).</w:t>
+      </w:r>
+    </w:p>
+    <w:p>
+      <w:pPr>
+        <w:pStyle w:val="Compact"/>
+        <w:numPr>
+          <w:ilvl w:val="0"/>
+          <w:numId w:val="19"/>
+        </w:numPr>
+      </w:pPr>
+      <w:r>
+        <w:t>Identify likely wet basins and headwater zones; note drainage risks.</w:t>
+      </w:r>
+    </w:p>
+    <w:p>
+      <w:pPr>
+        <w:pStyle w:val="FirstParagraph"/>
+      </w:pPr>
+      <w:r>
+        <w:rPr>
+          <w:b/>
+          <w:bCs/>
+        </w:rPr>
+        <w:t>Candidate zones</w:t>
+      </w:r>
+    </w:p>
+    <w:p>
+      <w:pPr>
+        <w:pStyle w:val="Compact"/>
+        <w:numPr>
+          <w:ilvl w:val="0"/>
+          <w:numId w:val="20"/>
+        </w:numPr>
+      </w:pPr>
+      <w:r>
+        <w:t>Provide a small set of prioritised zones (e.g., 3-8) with bounding geometry references.</w:t>
+      </w:r>
+    </w:p>
+    <w:p>
+      <w:pPr>
+        <w:pStyle w:val="Compact"/>
+        <w:numPr>
+          <w:ilvl w:val="0"/>
+          <w:numId w:val="20"/>
+        </w:numPr>
+      </w:pPr>
+      <w:r>
+        <w:t>For each: what evidence supports peat likelihood, what is uncertain, and what field checks address it.</w:t>
+      </w:r>
+    </w:p>
+    <w:p>
+      <w:pPr>
+        <w:pStyle w:val="FirstParagraph"/>
+      </w:pPr>
+      <w:r>
+        <w:rPr>
+          <w:b/>
+          <w:bCs/>
+        </w:rPr>
+        <w:t>Fieldwork recommendations</w:t>
+      </w:r>
+    </w:p>
+    <w:p>
+      <w:pPr>
+        <w:pStyle w:val="Compact"/>
+        <w:numPr>
+          <w:ilvl w:val="0"/>
+          <w:numId w:val="21"/>
+        </w:numPr>
+      </w:pPr>
+      <w:r>
         <w:lastRenderedPageBreak/>
-        <w:t>Name the AOI and the authority for its geometry (AONB boundary, named-area polygon, or explicit approximation).</w:t>
-      </w:r>
-    </w:p>
-    <w:p>
-      <w:pPr>
-        <w:pStyle w:val="Compact"/>
-        <w:numPr>
-          <w:ilvl w:val="0"/>
-          <w:numId w:val="17"/>
-        </w:numPr>
-      </w:pPr>
-      <w:r>
-        <w:t>Provide the centroid/representative point, bbox, and polygon provenance (licence/copyright terms if relevant).</w:t>
-      </w:r>
-    </w:p>
-    <w:p>
-      <w:pPr>
-        <w:pStyle w:val="Compact"/>
-        <w:numPr>
-          <w:ilvl w:val="0"/>
-          <w:numId w:val="17"/>
-        </w:numPr>
-      </w:pPr>
-      <w:r>
-        <w:t>Provide the operational AOI used for queries (possibly an AOI buffer for hydrology catchments).</w:t>
-      </w:r>
-    </w:p>
-    <w:p>
-      <w:pPr>
-        <w:pStyle w:val="FirstParagraph"/>
-      </w:pPr>
-      <w:r>
-        <w:rPr>
-          <w:b/>
-          <w:bCs/>
-        </w:rPr>
-        <w:t>Peat indicators</w:t>
-      </w:r>
-    </w:p>
-    <w:p>
-      <w:pPr>
-        <w:pStyle w:val="Compact"/>
-        <w:numPr>
-          <w:ilvl w:val="0"/>
-          <w:numId w:val="18"/>
-        </w:numPr>
-      </w:pPr>
-      <w:r>
-        <w:t>Primary evidence (where available): peat extent probability, peat depth, peat condition, erosion/drainage features (grips, gullies, haggs, bare peat), vegetation on peaty soil. England Peat Map explicitly models these layers [2][7][8][9][10][11].</w:t>
-      </w:r>
-    </w:p>
-    <w:p>
-      <w:pPr>
-        <w:pStyle w:val="Compact"/>
-        <w:numPr>
-          <w:ilvl w:val="0"/>
-          <w:numId w:val="18"/>
-        </w:numPr>
-      </w:pPr>
-      <w:r>
-        <w:t>Secondary evidence: Priority Habitat Inventory classes relevant to peat such as blanket bog, lowland raised bog, fens, upland flushes/fens/swamps (as corroboration or targeting).</w:t>
-      </w:r>
-    </w:p>
-    <w:p>
-      <w:pPr>
-        <w:pStyle w:val="Compact"/>
-        <w:numPr>
-          <w:ilvl w:val="0"/>
-          <w:numId w:val="18"/>
-        </w:numPr>
-      </w:pPr>
-      <w:r>
-        <w:t>Proxies: land-cover categories (heath/rough grassland, marsh), topographic wetness, headwater density, mapped water bodies.</w:t>
-      </w:r>
-    </w:p>
-    <w:p>
-      <w:pPr>
-        <w:pStyle w:val="FirstParagraph"/>
-      </w:pPr>
-      <w:r>
-        <w:rPr>
-          <w:b/>
-          <w:bCs/>
-        </w:rPr>
-        <w:t>Hydrology context</w:t>
-      </w:r>
-    </w:p>
-    <w:p>
-      <w:pPr>
-        <w:pStyle w:val="Compact"/>
-        <w:numPr>
-          <w:ilvl w:val="0"/>
-          <w:numId w:val="19"/>
-        </w:numPr>
-      </w:pPr>
-      <w:r>
-        <w:t>Summarise surface water abundance and pattern (water bodies, water links/nodes, springs/ponds).</w:t>
-      </w:r>
-    </w:p>
-    <w:p>
-      <w:pPr>
-        <w:pStyle w:val="Compact"/>
-        <w:numPr>
-          <w:ilvl w:val="0"/>
-          <w:numId w:val="19"/>
-        </w:numPr>
-      </w:pPr>
-      <w:r>
-        <w:t>Identify likely wet basins and headwater zones; note drainage risks.</w:t>
-      </w:r>
-    </w:p>
-    <w:p>
-      <w:pPr>
-        <w:pStyle w:val="FirstParagraph"/>
-      </w:pPr>
-      <w:r>
-        <w:rPr>
-          <w:b/>
-          <w:bCs/>
-        </w:rPr>
-        <w:t>Candidate zones</w:t>
-      </w:r>
-    </w:p>
-    <w:p>
-      <w:pPr>
-        <w:pStyle w:val="Compact"/>
-        <w:numPr>
-          <w:ilvl w:val="0"/>
-          <w:numId w:val="20"/>
-        </w:numPr>
-      </w:pPr>
-      <w:r>
-        <w:t>Provide a small set of prioritised zones (e.g., 3-8) with bounding geometry references.</w:t>
-      </w:r>
-    </w:p>
-    <w:p>
-      <w:pPr>
-        <w:pStyle w:val="Compact"/>
-        <w:numPr>
-          <w:ilvl w:val="0"/>
-          <w:numId w:val="20"/>
-        </w:numPr>
-      </w:pPr>
-      <w:r>
-        <w:t>For each: what evidence supports peat likelihood, what is uncertain, and what field checks address it.</w:t>
-      </w:r>
-    </w:p>
-    <w:p>
-      <w:pPr>
-        <w:pStyle w:val="FirstParagraph"/>
-      </w:pPr>
-      <w:r>
-        <w:rPr>
-          <w:b/>
-          <w:bCs/>
-        </w:rPr>
-        <w:t>Fieldwork recommendations</w:t>
-      </w:r>
-    </w:p>
-    <w:p>
-      <w:pPr>
-        <w:pStyle w:val="Compact"/>
-        <w:numPr>
-          <w:ilvl w:val="0"/>
-          <w:numId w:val="21"/>
-        </w:numPr>
-      </w:pPr>
-      <w:r>
         <w:t>Access and safety: route planning, permissions, biosecurity.</w:t>
       </w:r>
     </w:p>
@@ -4749,7 +5563,6 @@
         </w:numPr>
       </w:pPr>
       <w:r>
-        <w:lastRenderedPageBreak/>
         <w:t>Primary peat layers (to be ingested/queried if available):</w:t>
       </w:r>
     </w:p>
@@ -5095,6 +5908,7 @@
           <w:b/>
           <w:bCs/>
         </w:rPr>
+        <w:lastRenderedPageBreak/>
         <w:t>Fieldwork recommendations</w:t>
       </w:r>
     </w:p>
@@ -5257,256 +6071,259 @@
         </w:numPr>
       </w:pPr>
       <w:r>
+        <w:t xml:space="preserve">Problem: </w:t>
+      </w:r>
+      <w:r>
+        <w:rPr>
+          <w:rStyle w:val="VerbatimChar"/>
+        </w:rPr>
+        <w:t>numberReturned</w:t>
+      </w:r>
+      <w:r>
+        <w:t xml:space="preserve"> can equal the requested </w:t>
+      </w:r>
+      <w:r>
+        <w:rPr>
+          <w:rStyle w:val="VerbatimChar"/>
+        </w:rPr>
+        <w:t>limit</w:t>
+      </w:r>
+      <w:r>
+        <w:t xml:space="preserve"> when </w:t>
+      </w:r>
+      <w:r>
+        <w:rPr>
+          <w:rStyle w:val="VerbatimChar"/>
+        </w:rPr>
+        <w:t>features=[]</w:t>
+      </w:r>
+      <w:r>
+        <w:t>, which is contract-breaking for pagination and QA.</w:t>
+      </w:r>
+    </w:p>
+    <w:p>
+      <w:pPr>
+        <w:pStyle w:val="Compact"/>
+        <w:numPr>
+          <w:ilvl w:val="0"/>
+          <w:numId w:val="34"/>
+        </w:numPr>
+      </w:pPr>
+      <w:r>
+        <w:t xml:space="preserve">Change: set </w:t>
+      </w:r>
+      <w:r>
+        <w:rPr>
+          <w:rStyle w:val="VerbatimChar"/>
+        </w:rPr>
+        <w:t>numberReturned = len(features)</w:t>
+      </w:r>
+      <w:r>
+        <w:t xml:space="preserve"> always; ensure </w:t>
+      </w:r>
+      <w:r>
+        <w:rPr>
+          <w:rStyle w:val="VerbatimChar"/>
+        </w:rPr>
+        <w:t>count</w:t>
+      </w:r>
+      <w:r>
+        <w:t xml:space="preserve"> is either </w:t>
+      </w:r>
+      <w:r>
+        <w:rPr>
+          <w:rStyle w:val="VerbatimChar"/>
+        </w:rPr>
+        <w:t>len(features)</w:t>
+      </w:r>
+      <w:r>
+        <w:t xml:space="preserve"> (returned count) or clearly documented as such; if "total matched" is known, provide it as </w:t>
+      </w:r>
+      <w:r>
+        <w:rPr>
+          <w:rStyle w:val="VerbatimChar"/>
+        </w:rPr>
+        <w:t>numberMatched</w:t>
+      </w:r>
+      <w:r>
+        <w:t xml:space="preserve"> (or </w:t>
+      </w:r>
+      <w:r>
+        <w:rPr>
+          <w:rStyle w:val="VerbatimChar"/>
+        </w:rPr>
+        <w:t>totalMatched</w:t>
+      </w:r>
+      <w:r>
+        <w:t>) consistent with OGC guidance [4].</w:t>
+      </w:r>
+    </w:p>
+    <w:p>
+      <w:pPr>
+        <w:pStyle w:val="Compact"/>
+        <w:numPr>
+          <w:ilvl w:val="0"/>
+          <w:numId w:val="34"/>
+        </w:numPr>
+      </w:pPr>
+      <w:r>
+        <w:t>Tests: empty results; partial-page results; paging completion.</w:t>
+      </w:r>
+    </w:p>
+    <w:p>
+      <w:pPr>
+        <w:pStyle w:val="FirstParagraph"/>
+      </w:pPr>
+      <w:r>
+        <w:rPr>
+          <w:b/>
+          <w:bCs/>
+        </w:rPr>
+        <w:t>Clamp and validate paging parameters</w:t>
+      </w:r>
+    </w:p>
+    <w:p>
+      <w:pPr>
+        <w:pStyle w:val="Compact"/>
+        <w:numPr>
+          <w:ilvl w:val="0"/>
+          <w:numId w:val="35"/>
+        </w:numPr>
+      </w:pPr>
+      <w:r>
+        <w:t xml:space="preserve">Enforce </w:t>
+      </w:r>
+      <w:r>
+        <w:rPr>
+          <w:rStyle w:val="VerbatimChar"/>
+        </w:rPr>
+        <w:t>limit &lt;= 100</w:t>
+      </w:r>
+      <w:r>
+        <w:t xml:space="preserve"> </w:t>
+      </w:r>
+      <w:r>
+        <w:t>for OS NGD API - Features. The official technical specification sets max=100 [3][6].</w:t>
+      </w:r>
+    </w:p>
+    <w:p>
+      <w:pPr>
+        <w:pStyle w:val="Compact"/>
+        <w:numPr>
+          <w:ilvl w:val="0"/>
+          <w:numId w:val="35"/>
+        </w:numPr>
+      </w:pPr>
+      <w:r>
+        <w:t xml:space="preserve">If a user requests higher, clamp and add a warning in a small </w:t>
+      </w:r>
+      <w:r>
+        <w:rPr>
+          <w:rStyle w:val="VerbatimChar"/>
+        </w:rPr>
+        <w:t>hints/warnings</w:t>
+      </w:r>
+      <w:r>
+        <w:t xml:space="preserve"> field (do not silently accept).</w:t>
+      </w:r>
+    </w:p>
+    <w:p>
+      <w:pPr>
+        <w:pStyle w:val="FirstParagraph"/>
+      </w:pPr>
+      <w:r>
+        <w:rPr>
+          <w:b/>
+          <w:bCs/>
+        </w:rPr>
+        <w:t>Default to thin mode for large-area queries</w:t>
+      </w:r>
+    </w:p>
+    <w:p>
+      <w:pPr>
+        <w:pStyle w:val="Compact"/>
+        <w:numPr>
+          <w:ilvl w:val="0"/>
+          <w:numId w:val="36"/>
+        </w:numPr>
+      </w:pPr>
+      <w:r>
+        <w:t xml:space="preserve">Default </w:t>
+      </w:r>
+      <w:r>
+        <w:rPr>
+          <w:rStyle w:val="VerbatimChar"/>
+        </w:rPr>
+        <w:t>includeGeometry=false</w:t>
+      </w:r>
+      <w:r>
+        <w:t xml:space="preserve"> unless explicitly requested.</w:t>
+      </w:r>
+    </w:p>
+    <w:p>
+      <w:pPr>
+        <w:pStyle w:val="Compact"/>
+        <w:numPr>
+          <w:ilvl w:val="0"/>
+          <w:numId w:val="36"/>
+        </w:numPr>
+      </w:pPr>
+      <w:r>
+        <w:t xml:space="preserve">Default </w:t>
+      </w:r>
+      <w:r>
+        <w:rPr>
+          <w:rStyle w:val="VerbatimChar"/>
+        </w:rPr>
+        <w:t>includeFields</w:t>
+      </w:r>
+      <w:r>
+        <w:t xml:space="preserve"> minimal; require explicit opt-in for rich attributive payloads.</w:t>
+      </w:r>
+    </w:p>
+    <w:p>
+      <w:pPr>
+        <w:pStyle w:val="FirstParagraph"/>
+      </w:pPr>
+      <w:r>
+        <w:rPr>
+          <w:b/>
+          <w:bCs/>
+        </w:rPr>
+        <w:t>Improve upstream timeout and retry handling</w:t>
+      </w:r>
+    </w:p>
+    <w:p>
+      <w:pPr>
+        <w:pStyle w:val="Compact"/>
+        <w:numPr>
+          <w:ilvl w:val="0"/>
+          <w:numId w:val="37"/>
+        </w:numPr>
+      </w:pPr>
+      <w:r>
+        <w:t xml:space="preserve">Evidence: upstream timeout surfaced as a 501 with </w:t>
+      </w:r>
+      <w:r>
+        <w:rPr>
+          <w:rStyle w:val="VerbatimChar"/>
+        </w:rPr>
+        <w:t>read timeout=5</w:t>
+      </w:r>
+      <w:r>
+        <w:t>.</w:t>
+      </w:r>
+    </w:p>
+    <w:p>
+      <w:pPr>
+        <w:pStyle w:val="Compact"/>
+        <w:numPr>
+          <w:ilvl w:val="0"/>
+          <w:numId w:val="37"/>
+        </w:numPr>
+      </w:pPr>
+      <w:r>
         <w:lastRenderedPageBreak/>
-        <w:t xml:space="preserve">Problem: </w:t>
-      </w:r>
-      <w:r>
-        <w:rPr>
-          <w:rStyle w:val="VerbatimChar"/>
-        </w:rPr>
-        <w:t>numberReturned</w:t>
-      </w:r>
-      <w:r>
-        <w:t xml:space="preserve"> can equal the requested </w:t>
-      </w:r>
-      <w:r>
-        <w:rPr>
-          <w:rStyle w:val="VerbatimChar"/>
-        </w:rPr>
-        <w:t>limit</w:t>
-      </w:r>
-      <w:r>
-        <w:t xml:space="preserve"> when </w:t>
-      </w:r>
-      <w:r>
-        <w:rPr>
-          <w:rStyle w:val="VerbatimChar"/>
-        </w:rPr>
-        <w:t>features=[]</w:t>
-      </w:r>
-      <w:r>
-        <w:t>, which is contract-breaking for pagination and QA.</w:t>
-      </w:r>
-    </w:p>
-    <w:p>
-      <w:pPr>
-        <w:pStyle w:val="Compact"/>
-        <w:numPr>
-          <w:ilvl w:val="0"/>
-          <w:numId w:val="34"/>
-        </w:numPr>
-      </w:pPr>
-      <w:r>
-        <w:t xml:space="preserve">Change: set </w:t>
-      </w:r>
-      <w:r>
-        <w:rPr>
-          <w:rStyle w:val="VerbatimChar"/>
-        </w:rPr>
-        <w:t>numberReturned = len(features)</w:t>
-      </w:r>
-      <w:r>
-        <w:t xml:space="preserve"> always; ensure </w:t>
-      </w:r>
-      <w:r>
-        <w:rPr>
-          <w:rStyle w:val="VerbatimChar"/>
-        </w:rPr>
-        <w:t>count</w:t>
-      </w:r>
-      <w:r>
-        <w:t xml:space="preserve"> is either </w:t>
-      </w:r>
-      <w:r>
-        <w:rPr>
-          <w:rStyle w:val="VerbatimChar"/>
-        </w:rPr>
-        <w:t>len(features)</w:t>
-      </w:r>
-      <w:r>
-        <w:t xml:space="preserve"> (returned count) or clearly documented as such; if "total matched" is known, provide it as </w:t>
-      </w:r>
-      <w:r>
-        <w:rPr>
-          <w:rStyle w:val="VerbatimChar"/>
-        </w:rPr>
-        <w:t>numberMatched</w:t>
-      </w:r>
-      <w:r>
-        <w:t xml:space="preserve"> (or </w:t>
-      </w:r>
-      <w:r>
-        <w:rPr>
-          <w:rStyle w:val="VerbatimChar"/>
-        </w:rPr>
-        <w:t>totalMatched</w:t>
-      </w:r>
-      <w:r>
-        <w:t>) consistent with OGC guidance [4].</w:t>
-      </w:r>
-    </w:p>
-    <w:p>
-      <w:pPr>
-        <w:pStyle w:val="Compact"/>
-        <w:numPr>
-          <w:ilvl w:val="0"/>
-          <w:numId w:val="34"/>
-        </w:numPr>
-      </w:pPr>
-      <w:r>
-        <w:t>Tests: empty results; partial-page results; paging completion.</w:t>
-      </w:r>
-    </w:p>
-    <w:p>
-      <w:pPr>
-        <w:pStyle w:val="FirstParagraph"/>
-      </w:pPr>
-      <w:r>
-        <w:rPr>
-          <w:b/>
-          <w:bCs/>
-        </w:rPr>
-        <w:t>Clamp and validate paging parameters</w:t>
-      </w:r>
-    </w:p>
-    <w:p>
-      <w:pPr>
-        <w:pStyle w:val="Compact"/>
-        <w:numPr>
-          <w:ilvl w:val="0"/>
-          <w:numId w:val="35"/>
-        </w:numPr>
-      </w:pPr>
-      <w:r>
-        <w:t xml:space="preserve">Enforce </w:t>
-      </w:r>
-      <w:r>
-        <w:rPr>
-          <w:rStyle w:val="VerbatimChar"/>
-        </w:rPr>
-        <w:t>limit &lt;= 100</w:t>
-      </w:r>
-      <w:r>
-        <w:t xml:space="preserve"> for OS NGD API - Features. The official technical specification sets max=100 [3][6].</w:t>
-      </w:r>
-    </w:p>
-    <w:p>
-      <w:pPr>
-        <w:pStyle w:val="Compact"/>
-        <w:numPr>
-          <w:ilvl w:val="0"/>
-          <w:numId w:val="35"/>
-        </w:numPr>
-      </w:pPr>
-      <w:r>
-        <w:t xml:space="preserve">If a user requests higher, clamp and add a warning in a small </w:t>
-      </w:r>
-      <w:r>
-        <w:rPr>
-          <w:rStyle w:val="VerbatimChar"/>
-        </w:rPr>
-        <w:t>hints/warnings</w:t>
-      </w:r>
-      <w:r>
-        <w:t xml:space="preserve"> field (do not silently accept).</w:t>
-      </w:r>
-    </w:p>
-    <w:p>
-      <w:pPr>
-        <w:pStyle w:val="FirstParagraph"/>
-      </w:pPr>
-      <w:r>
-        <w:rPr>
-          <w:b/>
-          <w:bCs/>
-        </w:rPr>
-        <w:t>Default to thin mode for large-area queries</w:t>
-      </w:r>
-    </w:p>
-    <w:p>
-      <w:pPr>
-        <w:pStyle w:val="Compact"/>
-        <w:numPr>
-          <w:ilvl w:val="0"/>
-          <w:numId w:val="36"/>
-        </w:numPr>
-      </w:pPr>
-      <w:r>
-        <w:t xml:space="preserve">Default </w:t>
-      </w:r>
-      <w:r>
-        <w:rPr>
-          <w:rStyle w:val="VerbatimChar"/>
-        </w:rPr>
-        <w:t>includeGeometry=false</w:t>
-      </w:r>
-      <w:r>
-        <w:t xml:space="preserve"> unless explicitly requested.</w:t>
-      </w:r>
-    </w:p>
-    <w:p>
-      <w:pPr>
-        <w:pStyle w:val="Compact"/>
-        <w:numPr>
-          <w:ilvl w:val="0"/>
-          <w:numId w:val="36"/>
-        </w:numPr>
-      </w:pPr>
-      <w:r>
-        <w:t xml:space="preserve">Default </w:t>
-      </w:r>
-      <w:r>
-        <w:rPr>
-          <w:rStyle w:val="VerbatimChar"/>
-        </w:rPr>
-        <w:t>includeFields</w:t>
-      </w:r>
-      <w:r>
-        <w:t xml:space="preserve"> minimal; require explicit opt-in for rich attributive payloads.</w:t>
-      </w:r>
-    </w:p>
-    <w:p>
-      <w:pPr>
-        <w:pStyle w:val="FirstParagraph"/>
-      </w:pPr>
-      <w:r>
-        <w:rPr>
-          <w:b/>
-          <w:bCs/>
-        </w:rPr>
-        <w:t>Improve upstream timeout and retry handling</w:t>
-      </w:r>
-    </w:p>
-    <w:p>
-      <w:pPr>
-        <w:pStyle w:val="Compact"/>
-        <w:numPr>
-          <w:ilvl w:val="0"/>
-          <w:numId w:val="37"/>
-        </w:numPr>
-      </w:pPr>
-      <w:r>
-        <w:t xml:space="preserve">Evidence: upstream timeout surfaced as a 501 with </w:t>
-      </w:r>
-      <w:r>
-        <w:rPr>
-          <w:rStyle w:val="VerbatimChar"/>
-        </w:rPr>
-        <w:t>read timeout=5</w:t>
-      </w:r>
-      <w:r>
-        <w:t>.</w:t>
-      </w:r>
-    </w:p>
-    <w:p>
-      <w:pPr>
-        <w:pStyle w:val="Compact"/>
-        <w:numPr>
-          <w:ilvl w:val="0"/>
-          <w:numId w:val="37"/>
-        </w:numPr>
-      </w:pPr>
-      <w:r>
         <w:t>Change: configurable upstream timeouts (separate connect/read), automatic retry with backoff for idempotent GET requests, and a "degrade plan": halve bbox, reduce limit, and disable geometry on retry.</w:t>
       </w:r>
     </w:p>
@@ -5724,7 +6541,6 @@
         </w:numPr>
       </w:pPr>
       <w:r>
-        <w:lastRenderedPageBreak/>
         <w:t xml:space="preserve">Indicate whether filtering occurred upstream or locally (e.g., </w:t>
       </w:r>
       <w:r>
@@ -5840,6 +6656,7 @@
         </w:numPr>
       </w:pPr>
       <w:r>
+        <w:lastRenderedPageBreak/>
         <w:t>Result: the server can resolve "Forest of Bowland" to an authoritative protected-landscape polygon quickly, avoiding the "ward fallback".</w:t>
       </w:r>
     </w:p>
@@ -6110,7 +6927,6 @@
           <w:b/>
           <w:bCs/>
         </w:rPr>
-        <w:lastRenderedPageBreak/>
         <w:t>Routing improvements for environmental surveys</w:t>
       </w:r>
       <w:r>
@@ -6245,6 +7061,7 @@
         </w:numPr>
       </w:pPr>
       <w:r>
+        <w:lastRenderedPageBreak/>
         <w:t xml:space="preserve">OS NGD API Features technical specification (overview): </w:t>
       </w:r>
       <w:hyperlink r:id="rId12">
@@ -6439,12 +7256,9 @@
       <w:bookmarkEnd w:id="19"/>
     </w:p>
     <w:sectPr>
-      <w:headerReference w:type="even" r:id="rId22"/>
-      <w:headerReference w:type="default" r:id="rId23"/>
-      <w:footerReference w:type="even" r:id="rId24"/>
-      <w:footerReference w:type="default" r:id="rId25"/>
-      <w:headerReference w:type="first" r:id="rId26"/>
-      <w:footerReference w:type="first" r:id="rId27"/>
+      <w:headerReference w:type="default" r:id="rId22"/>
+      <w:footerReference w:type="even" r:id="rId23"/>
+      <w:footerReference w:type="default" r:id="rId24"/>
       <w:footnotePr>
         <w:numRestart w:val="eachSect"/>
       </w:footnotePr>
@@ -6484,9 +7298,57 @@
 
 <file path=word/footer1.xml><?xml version="1.0" encoding="utf-8"?>
 <w:ftr xmlns:wpc="http://schemas.microsoft.com/office/word/2010/wordprocessingCanvas" xmlns:cx="http://schemas.microsoft.com/office/drawing/2014/chartex" xmlns:cx1="http://schemas.microsoft.com/office/drawing/2015/9/8/chartex" xmlns:cx2="http://schemas.microsoft.com/office/drawing/2015/10/21/chartex" xmlns:cx3="http://schemas.microsoft.com/office/drawing/2016/5/9/chartex" xmlns:cx4="http://schemas.microsoft.com/office/drawing/2016/5/10/chartex" xmlns:cx5="http://schemas.microsoft.com/office/drawing/2016/5/11/chartex" xmlns:cx6="http://schemas.microsoft.com/office/drawing/2016/5/12/chartex" xmlns:cx7="http://schemas.microsoft.com/office/drawing/2016/5/13/chartex" xmlns:cx8="http://schemas.microsoft.com/office/drawing/2016/5/14/chartex" xmlns:mc="http://schemas.openxmlformats.org/markup-compatibility/2006" xmlns:aink="http://schemas.microsoft.com/office/drawing/2016/ink" xmlns:am3d="http://schemas.microsoft.com/office/drawing/2017/model3d" xmlns:o="urn:schemas-microsoft-com:office:office" xmlns:oel="http://schemas.microsoft.com/office/2019/extlst" xmlns:r="http://schemas.openxmlformats.org/officeDocument/2006/relationships" xmlns:m="http://schemas.openxmlformats.org/officeDocument/2006/math" xmlns:v="urn:schemas-microsoft-com:vml" xmlns:wp14="http://schemas.microsoft.com/office/word/2010/wordprocessingDrawing" xmlns:wp="http://schemas.openxmlformats.org/drawingml/2006/wordprocessingDrawing" xmlns:w10="urn:schemas-microsoft-com:office:word" xmlns:w="http://schemas.openxmlformats.org/wordprocessingml/2006/main" xmlns:w14="http://schemas.microsoft.com/office/word/2010/wordml" xmlns:w15="http://schemas.microsoft.com/office/word/2012/wordml" xmlns:w16cex="http://schemas.microsoft.com/office/word/2018/wordml/cex" xmlns:w16cid="http://schemas.microsoft.com/office/word/2016/wordml/cid" xmlns:w16="http://schemas.microsoft.com/office/word/2018/wordml" xmlns:w16du="http://schemas.microsoft.com/office/word/2023/wordml/word16du" xmlns:w16sdtdh="http://schemas.microsoft.com/office/word/2020/wordml/sdtdatahash" xmlns:w16sdtfl="http://schemas.microsoft.com/office/word/2024/wordml/sdtformatlock" xmlns:w16se="http://schemas.microsoft.com/office/word/2015/wordml/symex" xmlns:wpg="http://schemas.microsoft.com/office/word/2010/wordprocessingGroup" xmlns:wpi="http://schemas.microsoft.com/office/word/2010/wordprocessingInk" xmlns:wne="http://schemas.microsoft.com/office/word/2006/wordml" xmlns:wps="http://schemas.microsoft.com/office/word/2010/wordprocessingShape" mc:Ignorable="w14 w15 w16se w16cid w16 w16cex w16sdtdh w16sdtfl w16du wp14">
+  <w:sdt>
+    <w:sdtPr>
+      <w:rPr>
+        <w:rStyle w:val="PageNumber"/>
+      </w:rPr>
+      <w:id w:val="-927965692"/>
+      <w:docPartObj>
+        <w:docPartGallery w:val="Page Numbers (Bottom of Page)"/>
+        <w:docPartUnique/>
+      </w:docPartObj>
+    </w:sdtPr>
+    <w:sdtContent>
+      <w:p>
+        <w:pPr>
+          <w:pStyle w:val="Footer"/>
+          <w:framePr w:wrap="none" w:vAnchor="text" w:hAnchor="margin" w:xAlign="right" w:y="1"/>
+          <w:rPr>
+            <w:rStyle w:val="PageNumber"/>
+          </w:rPr>
+        </w:pPr>
+        <w:r>
+          <w:rPr>
+            <w:rStyle w:val="PageNumber"/>
+          </w:rPr>
+          <w:fldChar w:fldCharType="begin"/>
+        </w:r>
+        <w:r>
+          <w:rPr>
+            <w:rStyle w:val="PageNumber"/>
+          </w:rPr>
+          <w:instrText xml:space="preserve"> PAGE </w:instrText>
+        </w:r>
+        <w:r>
+          <w:rPr>
+            <w:rStyle w:val="PageNumber"/>
+          </w:rPr>
+          <w:fldChar w:fldCharType="separate"/>
+        </w:r>
+        <w:r>
+          <w:rPr>
+            <w:rStyle w:val="PageNumber"/>
+          </w:rPr>
+          <w:fldChar w:fldCharType="end"/>
+        </w:r>
+      </w:p>
+    </w:sdtContent>
+  </w:sdt>
   <w:p>
     <w:pPr>
       <w:pStyle w:val="Footer"/>
+      <w:ind w:right="360"/>
     </w:pPr>
   </w:p>
 </w:ftr>
@@ -6494,19 +7356,64 @@
 
 <file path=word/footer2.xml><?xml version="1.0" encoding="utf-8"?>
 <w:ftr xmlns:wpc="http://schemas.microsoft.com/office/word/2010/wordprocessingCanvas" xmlns:cx="http://schemas.microsoft.com/office/drawing/2014/chartex" xmlns:cx1="http://schemas.microsoft.com/office/drawing/2015/9/8/chartex" xmlns:cx2="http://schemas.microsoft.com/office/drawing/2015/10/21/chartex" xmlns:cx3="http://schemas.microsoft.com/office/drawing/2016/5/9/chartex" xmlns:cx4="http://schemas.microsoft.com/office/drawing/2016/5/10/chartex" xmlns:cx5="http://schemas.microsoft.com/office/drawing/2016/5/11/chartex" xmlns:cx6="http://schemas.microsoft.com/office/drawing/2016/5/12/chartex" xmlns:cx7="http://schemas.microsoft.com/office/drawing/2016/5/13/chartex" xmlns:cx8="http://schemas.microsoft.com/office/drawing/2016/5/14/chartex" xmlns:mc="http://schemas.openxmlformats.org/markup-compatibility/2006" xmlns:aink="http://schemas.microsoft.com/office/drawing/2016/ink" xmlns:am3d="http://schemas.microsoft.com/office/drawing/2017/model3d" xmlns:o="urn:schemas-microsoft-com:office:office" xmlns:oel="http://schemas.microsoft.com/office/2019/extlst" xmlns:r="http://schemas.openxmlformats.org/officeDocument/2006/relationships" xmlns:m="http://schemas.openxmlformats.org/officeDocument/2006/math" xmlns:v="urn:schemas-microsoft-com:vml" xmlns:wp14="http://schemas.microsoft.com/office/word/2010/wordprocessingDrawing" xmlns:wp="http://schemas.openxmlformats.org/drawingml/2006/wordprocessingDrawing" xmlns:w10="urn:schemas-microsoft-com:office:word" xmlns:w="http://schemas.openxmlformats.org/wordprocessingml/2006/main" xmlns:w14="http://schemas.microsoft.com/office/word/2010/wordml" xmlns:w15="http://schemas.microsoft.com/office/word/2012/wordml" xmlns:w16cex="http://schemas.microsoft.com/office/word/2018/wordml/cex" xmlns:w16cid="http://schemas.microsoft.com/office/word/2016/wordml/cid" xmlns:w16="http://schemas.microsoft.com/office/word/2018/wordml" xmlns:w16du="http://schemas.microsoft.com/office/word/2023/wordml/word16du" xmlns:w16sdtdh="http://schemas.microsoft.com/office/word/2020/wordml/sdtdatahash" xmlns:w16sdtfl="http://schemas.microsoft.com/office/word/2024/wordml/sdtformatlock" xmlns:w16se="http://schemas.microsoft.com/office/word/2015/wordml/symex" xmlns:wpg="http://schemas.microsoft.com/office/word/2010/wordprocessingGroup" xmlns:wpi="http://schemas.microsoft.com/office/word/2010/wordprocessingInk" xmlns:wne="http://schemas.microsoft.com/office/word/2006/wordml" xmlns:wps="http://schemas.microsoft.com/office/word/2010/wordprocessingShape" mc:Ignorable="w14 w15 w16se w16cid w16 w16cex w16sdtdh w16sdtfl w16du wp14">
+  <w:sdt>
+    <w:sdtPr>
+      <w:rPr>
+        <w:rStyle w:val="PageNumber"/>
+      </w:rPr>
+      <w:id w:val="1317760270"/>
+      <w:docPartObj>
+        <w:docPartGallery w:val="Page Numbers (Bottom of Page)"/>
+        <w:docPartUnique/>
+      </w:docPartObj>
+    </w:sdtPr>
+    <w:sdtContent>
+      <w:p>
+        <w:pPr>
+          <w:pStyle w:val="Footer"/>
+          <w:framePr w:wrap="none" w:vAnchor="text" w:hAnchor="margin" w:xAlign="right" w:y="1"/>
+          <w:rPr>
+            <w:rStyle w:val="PageNumber"/>
+          </w:rPr>
+        </w:pPr>
+        <w:r>
+          <w:rPr>
+            <w:rStyle w:val="PageNumber"/>
+          </w:rPr>
+          <w:fldChar w:fldCharType="begin"/>
+        </w:r>
+        <w:r>
+          <w:rPr>
+            <w:rStyle w:val="PageNumber"/>
+          </w:rPr>
+          <w:instrText xml:space="preserve"> PAGE </w:instrText>
+        </w:r>
+        <w:r>
+          <w:rPr>
+            <w:rStyle w:val="PageNumber"/>
+          </w:rPr>
+          <w:fldChar w:fldCharType="separate"/>
+        </w:r>
+        <w:r>
+          <w:rPr>
+            <w:rStyle w:val="PageNumber"/>
+            <w:noProof/>
+          </w:rPr>
+          <w:t>1</w:t>
+        </w:r>
+        <w:r>
+          <w:rPr>
+            <w:rStyle w:val="PageNumber"/>
+          </w:rPr>
+          <w:fldChar w:fldCharType="end"/>
+        </w:r>
+      </w:p>
+    </w:sdtContent>
+  </w:sdt>
   <w:p>
     <w:pPr>
       <w:pStyle w:val="Footer"/>
-    </w:pPr>
-  </w:p>
-</w:ftr>
-</file>
-
-<file path=word/footer3.xml><?xml version="1.0" encoding="utf-8"?>
-<w:ftr xmlns:wpc="http://schemas.microsoft.com/office/word/2010/wordprocessingCanvas" xmlns:cx="http://schemas.microsoft.com/office/drawing/2014/chartex" xmlns:cx1="http://schemas.microsoft.com/office/drawing/2015/9/8/chartex" xmlns:cx2="http://schemas.microsoft.com/office/drawing/2015/10/21/chartex" xmlns:cx3="http://schemas.microsoft.com/office/drawing/2016/5/9/chartex" xmlns:cx4="http://schemas.microsoft.com/office/drawing/2016/5/10/chartex" xmlns:cx5="http://schemas.microsoft.com/office/drawing/2016/5/11/chartex" xmlns:cx6="http://schemas.microsoft.com/office/drawing/2016/5/12/chartex" xmlns:cx7="http://schemas.microsoft.com/office/drawing/2016/5/13/chartex" xmlns:cx8="http://schemas.microsoft.com/office/drawing/2016/5/14/chartex" xmlns:mc="http://schemas.openxmlformats.org/markup-compatibility/2006" xmlns:aink="http://schemas.microsoft.com/office/drawing/2016/ink" xmlns:am3d="http://schemas.microsoft.com/office/drawing/2017/model3d" xmlns:o="urn:schemas-microsoft-com:office:office" xmlns:oel="http://schemas.microsoft.com/office/2019/extlst" xmlns:r="http://schemas.openxmlformats.org/officeDocument/2006/relationships" xmlns:m="http://schemas.openxmlformats.org/officeDocument/2006/math" xmlns:v="urn:schemas-microsoft-com:vml" xmlns:wp14="http://schemas.microsoft.com/office/word/2010/wordprocessingDrawing" xmlns:wp="http://schemas.openxmlformats.org/drawingml/2006/wordprocessingDrawing" xmlns:w10="urn:schemas-microsoft-com:office:word" xmlns:w="http://schemas.openxmlformats.org/wordprocessingml/2006/main" xmlns:w14="http://schemas.microsoft.com/office/word/2010/wordml" xmlns:w15="http://schemas.microsoft.com/office/word/2012/wordml" xmlns:w16cex="http://schemas.microsoft.com/office/word/2018/wordml/cex" xmlns:w16cid="http://schemas.microsoft.com/office/word/2016/wordml/cid" xmlns:w16="http://schemas.microsoft.com/office/word/2018/wordml" xmlns:w16du="http://schemas.microsoft.com/office/word/2023/wordml/word16du" xmlns:w16sdtdh="http://schemas.microsoft.com/office/word/2020/wordml/sdtdatahash" xmlns:w16sdtfl="http://schemas.microsoft.com/office/word/2024/wordml/sdtformatlock" xmlns:w16se="http://schemas.microsoft.com/office/word/2015/wordml/symex" xmlns:wpg="http://schemas.microsoft.com/office/word/2010/wordprocessingGroup" xmlns:wpi="http://schemas.microsoft.com/office/word/2010/wordprocessingInk" xmlns:wne="http://schemas.microsoft.com/office/word/2006/wordml" xmlns:wps="http://schemas.microsoft.com/office/word/2010/wordprocessingShape" mc:Ignorable="w14 w15 w16se w16cid w16 w16cex w16sdtdh w16sdtfl w16du wp14">
-  <w:p>
-    <w:pPr>
-      <w:pStyle w:val="Footer"/>
+      <w:ind w:right="360"/>
     </w:pPr>
   </w:p>
 </w:ftr>
@@ -6542,27 +7449,54 @@
   <w:p>
     <w:pPr>
       <w:pStyle w:val="Header"/>
+      <w:jc w:val="right"/>
     </w:pPr>
-  </w:p>
-</w:hdr>
-</file>
-
-<file path=word/header2.xml><?xml version="1.0" encoding="utf-8"?>
-<w:hdr xmlns:wpc="http://schemas.microsoft.com/office/word/2010/wordprocessingCanvas" xmlns:cx="http://schemas.microsoft.com/office/drawing/2014/chartex" xmlns:cx1="http://schemas.microsoft.com/office/drawing/2015/9/8/chartex" xmlns:cx2="http://schemas.microsoft.com/office/drawing/2015/10/21/chartex" xmlns:cx3="http://schemas.microsoft.com/office/drawing/2016/5/9/chartex" xmlns:cx4="http://schemas.microsoft.com/office/drawing/2016/5/10/chartex" xmlns:cx5="http://schemas.microsoft.com/office/drawing/2016/5/11/chartex" xmlns:cx6="http://schemas.microsoft.com/office/drawing/2016/5/12/chartex" xmlns:cx7="http://schemas.microsoft.com/office/drawing/2016/5/13/chartex" xmlns:cx8="http://schemas.microsoft.com/office/drawing/2016/5/14/chartex" xmlns:mc="http://schemas.openxmlformats.org/markup-compatibility/2006" xmlns:aink="http://schemas.microsoft.com/office/drawing/2016/ink" xmlns:am3d="http://schemas.microsoft.com/office/drawing/2017/model3d" xmlns:o="urn:schemas-microsoft-com:office:office" xmlns:oel="http://schemas.microsoft.com/office/2019/extlst" xmlns:r="http://schemas.openxmlformats.org/officeDocument/2006/relationships" xmlns:m="http://schemas.openxmlformats.org/officeDocument/2006/math" xmlns:v="urn:schemas-microsoft-com:vml" xmlns:wp14="http://schemas.microsoft.com/office/word/2010/wordprocessingDrawing" xmlns:wp="http://schemas.openxmlformats.org/drawingml/2006/wordprocessingDrawing" xmlns:w10="urn:schemas-microsoft-com:office:word" xmlns:w="http://schemas.openxmlformats.org/wordprocessingml/2006/main" xmlns:w14="http://schemas.microsoft.com/office/word/2010/wordml" xmlns:w15="http://schemas.microsoft.com/office/word/2012/wordml" xmlns:w16cex="http://schemas.microsoft.com/office/word/2018/wordml/cex" xmlns:w16cid="http://schemas.microsoft.com/office/word/2016/wordml/cid" xmlns:w16="http://schemas.microsoft.com/office/word/2018/wordml" xmlns:w16du="http://schemas.microsoft.com/office/word/2023/wordml/word16du" xmlns:w16sdtdh="http://schemas.microsoft.com/office/word/2020/wordml/sdtdatahash" xmlns:w16sdtfl="http://schemas.microsoft.com/office/word/2024/wordml/sdtformatlock" xmlns:w16se="http://schemas.microsoft.com/office/word/2015/wordml/symex" xmlns:wpg="http://schemas.microsoft.com/office/word/2010/wordprocessingGroup" xmlns:wpi="http://schemas.microsoft.com/office/word/2010/wordprocessingInk" xmlns:wne="http://schemas.microsoft.com/office/word/2006/wordml" xmlns:wps="http://schemas.microsoft.com/office/word/2010/wordprocessingShape" mc:Ignorable="w14 w15 w16se w16cid w16 w16cex w16sdtdh w16sdtfl w16du wp14">
-  <w:p>
-    <w:pPr>
-      <w:pStyle w:val="Header"/>
-    </w:pPr>
-  </w:p>
-</w:hdr>
-</file>
-
-<file path=word/header3.xml><?xml version="1.0" encoding="utf-8"?>
-<w:hdr xmlns:wpc="http://schemas.microsoft.com/office/word/2010/wordprocessingCanvas" xmlns:cx="http://schemas.microsoft.com/office/drawing/2014/chartex" xmlns:cx1="http://schemas.microsoft.com/office/drawing/2015/9/8/chartex" xmlns:cx2="http://schemas.microsoft.com/office/drawing/2015/10/21/chartex" xmlns:cx3="http://schemas.microsoft.com/office/drawing/2016/5/9/chartex" xmlns:cx4="http://schemas.microsoft.com/office/drawing/2016/5/10/chartex" xmlns:cx5="http://schemas.microsoft.com/office/drawing/2016/5/11/chartex" xmlns:cx6="http://schemas.microsoft.com/office/drawing/2016/5/12/chartex" xmlns:cx7="http://schemas.microsoft.com/office/drawing/2016/5/13/chartex" xmlns:cx8="http://schemas.microsoft.com/office/drawing/2016/5/14/chartex" xmlns:mc="http://schemas.openxmlformats.org/markup-compatibility/2006" xmlns:aink="http://schemas.microsoft.com/office/drawing/2016/ink" xmlns:am3d="http://schemas.microsoft.com/office/drawing/2017/model3d" xmlns:o="urn:schemas-microsoft-com:office:office" xmlns:oel="http://schemas.microsoft.com/office/2019/extlst" xmlns:r="http://schemas.openxmlformats.org/officeDocument/2006/relationships" xmlns:m="http://schemas.openxmlformats.org/officeDocument/2006/math" xmlns:v="urn:schemas-microsoft-com:vml" xmlns:wp14="http://schemas.microsoft.com/office/word/2010/wordprocessingDrawing" xmlns:wp="http://schemas.openxmlformats.org/drawingml/2006/wordprocessingDrawing" xmlns:w10="urn:schemas-microsoft-com:office:word" xmlns:w="http://schemas.openxmlformats.org/wordprocessingml/2006/main" xmlns:w14="http://schemas.microsoft.com/office/word/2010/wordml" xmlns:w15="http://schemas.microsoft.com/office/word/2012/wordml" xmlns:w16cex="http://schemas.microsoft.com/office/word/2018/wordml/cex" xmlns:w16cid="http://schemas.microsoft.com/office/word/2016/wordml/cid" xmlns:w16="http://schemas.microsoft.com/office/word/2018/wordml" xmlns:w16du="http://schemas.microsoft.com/office/word/2023/wordml/word16du" xmlns:w16sdtdh="http://schemas.microsoft.com/office/word/2020/wordml/sdtdatahash" xmlns:w16sdtfl="http://schemas.microsoft.com/office/word/2024/wordml/sdtformatlock" xmlns:w16se="http://schemas.microsoft.com/office/word/2015/wordml/symex" xmlns:wpg="http://schemas.microsoft.com/office/word/2010/wordprocessingGroup" xmlns:wpi="http://schemas.microsoft.com/office/word/2010/wordprocessingInk" xmlns:wne="http://schemas.microsoft.com/office/word/2006/wordml" xmlns:wps="http://schemas.microsoft.com/office/word/2010/wordprocessingShape" mc:Ignorable="w14 w15 w16se w16cid w16 w16cex w16sdtdh w16sdtfl w16du wp14">
-  <w:p>
-    <w:pPr>
-      <w:pStyle w:val="Header"/>
-    </w:pPr>
+    <w:r>
+      <w:rPr>
+        <w:noProof/>
+      </w:rPr>
+      <w:drawing>
+        <wp:inline distT="0" distB="0" distL="0" distR="0" wp14:anchorId="2F08397A" wp14:editId="159EA32D">
+          <wp:extent cx="283314" cy="360000"/>
+          <wp:effectExtent l="0" t="0" r="0" b="0"/>
+          <wp:docPr id="176390180" name="Picture 1" descr="A logo for a computer&#10;&#10;AI-generated content may be incorrect."/>
+          <wp:cNvGraphicFramePr>
+            <a:graphicFrameLocks xmlns:a="http://schemas.openxmlformats.org/drawingml/2006/main" noChangeAspect="1"/>
+          </wp:cNvGraphicFramePr>
+          <a:graphic xmlns:a="http://schemas.openxmlformats.org/drawingml/2006/main">
+            <a:graphicData uri="http://schemas.openxmlformats.org/drawingml/2006/picture">
+              <pic:pic xmlns:pic="http://schemas.openxmlformats.org/drawingml/2006/picture">
+                <pic:nvPicPr>
+                  <pic:cNvPr id="176390180" name="Picture 1" descr="A logo for a computer&#10;&#10;AI-generated content may be incorrect."/>
+                  <pic:cNvPicPr/>
+                </pic:nvPicPr>
+                <pic:blipFill>
+                  <a:blip r:embed="rId1">
+                    <a:extLst>
+                      <a:ext uri="{28A0092B-C50C-407E-A947-70E740481C1C}">
+                        <a14:useLocalDpi xmlns:a14="http://schemas.microsoft.com/office/drawing/2010/main" val="0"/>
+                      </a:ext>
+                    </a:extLst>
+                  </a:blip>
+                  <a:stretch>
+                    <a:fillRect/>
+                  </a:stretch>
+                </pic:blipFill>
+                <pic:spPr>
+                  <a:xfrm>
+                    <a:off x="0" y="0"/>
+                    <a:ext cx="283314" cy="360000"/>
+                  </a:xfrm>
+                  <a:prstGeom prst="rect">
+                    <a:avLst/>
+                  </a:prstGeom>
+                </pic:spPr>
+              </pic:pic>
+            </a:graphicData>
+          </a:graphic>
+        </wp:inline>
+      </w:drawing>
+    </w:r>
   </w:p>
 </w:hdr>
 </file>
@@ -8344,6 +9278,11 @@
     <w:link w:val="Footer"/>
     <w:rsid w:val="00A22A29"/>
   </w:style>
+  <w:style w:type="character" w:styleId="PageNumber">
+    <w:name w:val="page number"/>
+    <w:basedOn w:val="DefaultParagraphFont"/>
+    <w:rsid w:val="005478A1"/>
+  </w:style>
 </w:styles>
 </file>
 

</xml_diff>